<commit_message>
comienzo punto 1- word
</commit_message>
<xml_diff>
--- a/TrabajoDos/Proyecto2_LuisaEncisoJuanCaguasango.docx
+++ b/TrabajoDos/Proyecto2_LuisaEncisoJuanCaguasango.docx
@@ -22,57 +22,7 @@
           <w:sz w:val="48"/>
           <w:szCs w:val="48"/>
         </w:rPr>
-        <w:t>Pr</w:t>
-      </w:r>
-      <w:r>
-        <w:rPr>
-          <w:rFonts w:cs="Times New Roman"/>
-          <w:b/>
-          <w:bCs/>
-          <w:sz w:val="48"/>
-          <w:szCs w:val="48"/>
-        </w:rPr>
-        <w:t>oyecto</w:t>
-      </w:r>
-      <w:r>
-        <w:rPr>
-          <w:rFonts w:cs="Times New Roman"/>
-          <w:b/>
-          <w:bCs/>
-          <w:sz w:val="48"/>
-          <w:szCs w:val="48"/>
-        </w:rPr>
-        <w:t xml:space="preserve"> </w:t>
-      </w:r>
-      <w:r>
-        <w:rPr>
-          <w:rFonts w:cs="Times New Roman"/>
-          <w:b/>
-          <w:bCs/>
-          <w:sz w:val="48"/>
-          <w:szCs w:val="48"/>
-        </w:rPr>
-        <w:t>2</w:t>
-      </w:r>
-      <w:r>
-        <w:rPr>
-          <w:rFonts w:cs="Times New Roman"/>
-          <w:b/>
-          <w:bCs/>
-          <w:sz w:val="48"/>
-          <w:szCs w:val="48"/>
-        </w:rPr>
-        <w:t xml:space="preserve">: </w:t>
-      </w:r>
-      <w:r>
-        <w:rPr>
-          <w:rFonts w:cs="Times New Roman"/>
-          <w:b/>
-          <w:bCs/>
-          <w:sz w:val="48"/>
-          <w:szCs w:val="48"/>
-        </w:rPr>
-        <w:t xml:space="preserve">Procesamiento digital de imágenes </w:t>
+        <w:t xml:space="preserve">Proyecto 2: Procesamiento digital de imágenes </w:t>
       </w:r>
     </w:p>
     <w:p>
@@ -112,31 +62,7 @@
           <w:i/>
           <w:iCs/>
         </w:rPr>
-        <w:t xml:space="preserve"> y </w:t>
-      </w:r>
-      <w:r>
-        <w:rPr>
-          <w:rFonts w:cs="Times New Roman"/>
-          <w:i/>
-          <w:iCs/>
-        </w:rPr>
-        <w:t>Juan D.</w:t>
-      </w:r>
-      <w:r>
-        <w:rPr>
-          <w:rFonts w:cs="Times New Roman"/>
-          <w:i/>
-          <w:iCs/>
-        </w:rPr>
-        <w:t xml:space="preserve"> </w:t>
-      </w:r>
-      <w:r>
-        <w:rPr>
-          <w:rFonts w:cs="Times New Roman"/>
-          <w:i/>
-          <w:iCs/>
-        </w:rPr>
-        <w:t>Caguasango</w:t>
+        <w:t xml:space="preserve"> y Juan D. Caguasango</w:t>
       </w:r>
       <w:r>
         <w:rPr>
@@ -291,8 +217,1175 @@
       </w:r>
     </w:p>
     <w:p>
+      <w:pPr>
+        <w:tabs>
+          <w:tab w:val="left" w:pos="818"/>
+          <w:tab w:val="center" w:pos="5449"/>
+        </w:tabs>
+        <w:spacing w:after="0"/>
+        <w:ind w:left="714" w:hanging="357"/>
+        <w:jc w:val="center"/>
+        <w:rPr>
+          <w:rFonts w:ascii="Courier New" w:hAnsi="Courier New" w:cs="Courier New"/>
+          <w:i/>
+          <w:iCs/>
+          <w:sz w:val="18"/>
+          <w:szCs w:val="18"/>
+        </w:rPr>
+      </w:pPr>
+    </w:p>
+    <w:p>
+      <w:pPr>
+        <w:tabs>
+          <w:tab w:val="left" w:pos="818"/>
+          <w:tab w:val="center" w:pos="5449"/>
+        </w:tabs>
+        <w:spacing w:after="0"/>
+        <w:ind w:left="714" w:hanging="357"/>
+        <w:jc w:val="center"/>
+        <w:rPr>
+          <w:rFonts w:ascii="Courier New" w:hAnsi="Courier New" w:cs="Courier New"/>
+          <w:i/>
+          <w:iCs/>
+          <w:sz w:val="18"/>
+          <w:szCs w:val="18"/>
+        </w:rPr>
+      </w:pPr>
+    </w:p>
+    <w:p>
       <w:r>
         <w:t>I. Conversión a formatos BIDS</w:t>
+      </w:r>
+    </w:p>
+    <w:p>
+      <w:pPr>
+        <w:rPr>
+          <w:b/>
+          <w:bCs/>
+          <w:sz w:val="24"/>
+          <w:szCs w:val="24"/>
+        </w:rPr>
+      </w:pPr>
+      <w:r>
+        <w:rPr>
+          <w:b/>
+          <w:bCs/>
+          <w:sz w:val="24"/>
+          <w:szCs w:val="24"/>
+        </w:rPr>
+        <w:t>Procedimiento para la organización y conversión de imágenes médicas al formato BIDS</w:t>
+      </w:r>
+    </w:p>
+    <w:p>
+      <w:r>
+        <w:t>A continuación, se describe el procedimiento seguido para organizar, convertir y estructurar un conjunto de imágenes médicas (en formato DICOM) siguiendo el estándar BIDS</w:t>
+      </w:r>
+      <w:r>
+        <w:t>.</w:t>
+      </w:r>
+    </w:p>
+    <w:p>
+      <w:r>
+        <w:rPr>
+          <w:b/>
+          <w:bCs/>
+          <w:i/>
+          <w:iCs/>
+          <w:sz w:val="24"/>
+          <w:szCs w:val="24"/>
+        </w:rPr>
+        <w:t>1.</w:t>
+      </w:r>
+      <w:r>
+        <w:rPr>
+          <w:b/>
+          <w:bCs/>
+          <w:i/>
+          <w:iCs/>
+          <w:sz w:val="24"/>
+          <w:szCs w:val="24"/>
+        </w:rPr>
+        <w:t>Estructuración de la carpeta de trabajo</w:t>
+      </w:r>
+      <w:r>
+        <w:br/>
+        <w:t>Se creó una estructura inicial de carpetas para organizar los datos:</w:t>
+      </w:r>
+      <w:r>
+        <w:br/>
+        <w:t>- Se generó una carpeta principal llamada DATA.</w:t>
+      </w:r>
+      <w:r>
+        <w:br/>
+        <w:t xml:space="preserve">- Dentro de DATA, se incluyó una carpeta denominada </w:t>
+      </w:r>
+      <w:r>
+        <w:rPr>
+          <w:b/>
+          <w:bCs/>
+        </w:rPr>
+        <w:t>raw</w:t>
+      </w:r>
+      <w:r>
+        <w:t>, en la cual se depositaron los archivos DICOM descomprimidos correspondientes a los distintos sujetos.</w:t>
+      </w:r>
+      <w:r>
+        <w:br/>
+        <w:t>- Adicionalmente, se creó una carpeta llamada BIDS donde se almacenará la estructura de datos convertida bajo el estándar BIDS.</w:t>
+      </w:r>
+    </w:p>
+    <w:p>
+      <w:pPr>
+        <w:jc w:val="center"/>
+      </w:pPr>
+      <w:r>
+        <w:rPr>
+          <w:noProof/>
+        </w:rPr>
+        <w:drawing>
+          <wp:inline distT="0" distB="0" distL="0" distR="0" wp14:anchorId="57E625C1" wp14:editId="369BC9D8">
+            <wp:extent cx="3582375" cy="729276"/>
+            <wp:effectExtent l="0" t="0" r="0" b="0"/>
+            <wp:docPr id="1319539722" name="Imagen 1"/>
+            <wp:cNvGraphicFramePr>
+              <a:graphicFrameLocks xmlns:a="http://schemas.openxmlformats.org/drawingml/2006/main" noChangeAspect="1"/>
+            </wp:cNvGraphicFramePr>
+            <a:graphic xmlns:a="http://schemas.openxmlformats.org/drawingml/2006/main">
+              <a:graphicData uri="http://schemas.openxmlformats.org/drawingml/2006/picture">
+                <pic:pic xmlns:pic="http://schemas.openxmlformats.org/drawingml/2006/picture">
+                  <pic:nvPicPr>
+                    <pic:cNvPr id="0" name="Picture 2"/>
+                    <pic:cNvPicPr>
+                      <a:picLocks noChangeAspect="1" noChangeArrowheads="1"/>
+                    </pic:cNvPicPr>
+                  </pic:nvPicPr>
+                  <pic:blipFill rotWithShape="1">
+                    <a:blip r:embed="rId7" cstate="print">
+                      <a:extLst>
+                        <a:ext uri="{28A0092B-C50C-407E-A947-70E740481C1C}">
+                          <a14:useLocalDpi xmlns:a14="http://schemas.microsoft.com/office/drawing/2010/main" val="0"/>
+                        </a:ext>
+                      </a:extLst>
+                    </a:blip>
+                    <a:srcRect l="10069" t="18656" r="36082" b="61845"/>
+                    <a:stretch/>
+                  </pic:blipFill>
+                  <pic:spPr bwMode="auto">
+                    <a:xfrm>
+                      <a:off x="0" y="0"/>
+                      <a:ext cx="3640230" cy="741054"/>
+                    </a:xfrm>
+                    <a:prstGeom prst="rect">
+                      <a:avLst/>
+                    </a:prstGeom>
+                    <a:noFill/>
+                    <a:ln>
+                      <a:noFill/>
+                    </a:ln>
+                    <a:extLst>
+                      <a:ext uri="{53640926-AAD7-44D8-BBD7-CCE9431645EC}">
+                        <a14:shadowObscured xmlns:a14="http://schemas.microsoft.com/office/drawing/2010/main"/>
+                      </a:ext>
+                    </a:extLst>
+                  </pic:spPr>
+                </pic:pic>
+              </a:graphicData>
+            </a:graphic>
+          </wp:inline>
+        </w:drawing>
+      </w:r>
+    </w:p>
+    <w:p>
+      <w:r>
+        <w:rPr>
+          <w:b/>
+          <w:bCs/>
+          <w:i/>
+          <w:iCs/>
+          <w:sz w:val="24"/>
+          <w:szCs w:val="24"/>
+        </w:rPr>
+        <w:t xml:space="preserve">2. Instalación y uso de </w:t>
+      </w:r>
+      <w:proofErr w:type="spellStart"/>
+      <w:r>
+        <w:rPr>
+          <w:b/>
+          <w:bCs/>
+          <w:i/>
+          <w:iCs/>
+          <w:sz w:val="24"/>
+          <w:szCs w:val="24"/>
+        </w:rPr>
+        <w:t>D</w:t>
+      </w:r>
+      <w:r>
+        <w:rPr>
+          <w:b/>
+          <w:bCs/>
+          <w:i/>
+          <w:iCs/>
+          <w:sz w:val="24"/>
+          <w:szCs w:val="24"/>
+        </w:rPr>
+        <w:t>icomsorter</w:t>
+      </w:r>
+      <w:proofErr w:type="spellEnd"/>
+      <w:r>
+        <w:br/>
+        <w:t xml:space="preserve">Para organizar los archivos DICOM por sujeto, se utilizó la herramienta </w:t>
+      </w:r>
+      <w:proofErr w:type="spellStart"/>
+      <w:r>
+        <w:t>dicomsorter</w:t>
+      </w:r>
+      <w:proofErr w:type="spellEnd"/>
+      <w:r>
+        <w:t>, la cual permite clasificar las imágenes por series dentro de carpetas jerárquicas.</w:t>
+      </w:r>
+      <w:r>
+        <w:br/>
+        <w:t>- Se abrió la terminal de comandos (CMD) en la ruta de la carpeta DATA.</w:t>
+      </w:r>
+      <w:r>
+        <w:br/>
+        <w:t>- Se instaló la herramienta ejecutando:</w:t>
+      </w:r>
+      <w:r>
+        <w:t xml:space="preserve">: </w:t>
+      </w:r>
+    </w:p>
+    <w:p>
+      <w:pPr>
+        <w:ind w:firstLine="708"/>
+        <w:rPr>
+          <w:i/>
+          <w:iCs/>
+        </w:rPr>
+      </w:pPr>
+      <w:proofErr w:type="spellStart"/>
+      <w:r>
+        <w:rPr>
+          <w:i/>
+          <w:iCs/>
+        </w:rPr>
+        <w:t>pip</w:t>
+      </w:r>
+      <w:proofErr w:type="spellEnd"/>
+      <w:r>
+        <w:rPr>
+          <w:i/>
+          <w:iCs/>
+        </w:rPr>
+        <w:t xml:space="preserve"> </w:t>
+      </w:r>
+      <w:proofErr w:type="spellStart"/>
+      <w:r>
+        <w:rPr>
+          <w:i/>
+          <w:iCs/>
+        </w:rPr>
+        <w:t>install</w:t>
+      </w:r>
+      <w:proofErr w:type="spellEnd"/>
+      <w:r>
+        <w:rPr>
+          <w:i/>
+          <w:iCs/>
+        </w:rPr>
+        <w:t xml:space="preserve"> </w:t>
+      </w:r>
+      <w:proofErr w:type="spellStart"/>
+      <w:r>
+        <w:rPr>
+          <w:i/>
+          <w:iCs/>
+        </w:rPr>
+        <w:t>dicomsorte</w:t>
+      </w:r>
+      <w:proofErr w:type="spellEnd"/>
+    </w:p>
+    <w:p>
+      <w:r>
+        <w:t>- Posteriormente, para cada sujeto se aplicó el siguiente comando, especificando tanto la carpeta de origen como la de destino:</w:t>
+      </w:r>
+    </w:p>
+    <w:p>
+      <w:pPr>
+        <w:ind w:firstLine="708"/>
+        <w:rPr>
+          <w:i/>
+          <w:iCs/>
+        </w:rPr>
+      </w:pPr>
+      <w:proofErr w:type="spellStart"/>
+      <w:r>
+        <w:rPr>
+          <w:i/>
+          <w:iCs/>
+        </w:rPr>
+        <w:t>dicomsorter</w:t>
+      </w:r>
+      <w:proofErr w:type="spellEnd"/>
+      <w:r>
+        <w:rPr>
+          <w:i/>
+          <w:iCs/>
+        </w:rPr>
+        <w:t xml:space="preserve"> "ruta/carpeta/origen" "ruta/carpeta/destino"</w:t>
+      </w:r>
+    </w:p>
+    <w:p>
+      <w:r>
+        <w:t>Ejemplo:</w:t>
+      </w:r>
+    </w:p>
+    <w:p>
+      <w:pPr>
+        <w:ind w:firstLine="708"/>
+        <w:rPr>
+          <w:i/>
+          <w:iCs/>
+        </w:rPr>
+      </w:pPr>
+      <w:proofErr w:type="spellStart"/>
+      <w:r>
+        <w:rPr>
+          <w:i/>
+          <w:iCs/>
+        </w:rPr>
+        <w:t>dicomsorter</w:t>
+      </w:r>
+      <w:proofErr w:type="spellEnd"/>
+      <w:r>
+        <w:rPr>
+          <w:i/>
+          <w:iCs/>
+        </w:rPr>
+        <w:t xml:space="preserve"> "C:\...\DATA\raw\0001" "C:\...\DATA\raw\sub-0001"</w:t>
+      </w:r>
+    </w:p>
+    <w:p>
+      <w:r>
+        <w:t>Nota: Es importante incluir el prefijo sub- en el nombre del directorio de salida, siguiendo la convención de nombres de BIDS</w:t>
+      </w:r>
+    </w:p>
+    <w:p>
+      <w:pPr>
+        <w:jc w:val="center"/>
+      </w:pPr>
+      <w:r>
+        <w:rPr>
+          <w:noProof/>
+        </w:rPr>
+        <w:lastRenderedPageBreak/>
+        <w:drawing>
+          <wp:inline distT="0" distB="0" distL="0" distR="0" wp14:anchorId="6322854A" wp14:editId="44365F2E">
+            <wp:extent cx="3487381" cy="1009766"/>
+            <wp:effectExtent l="0" t="0" r="0" b="0"/>
+            <wp:docPr id="1700477736" name="Imagen 2"/>
+            <wp:cNvGraphicFramePr>
+              <a:graphicFrameLocks xmlns:a="http://schemas.openxmlformats.org/drawingml/2006/main" noChangeAspect="1"/>
+            </wp:cNvGraphicFramePr>
+            <a:graphic xmlns:a="http://schemas.openxmlformats.org/drawingml/2006/main">
+              <a:graphicData uri="http://schemas.openxmlformats.org/drawingml/2006/picture">
+                <pic:pic xmlns:pic="http://schemas.openxmlformats.org/drawingml/2006/picture">
+                  <pic:nvPicPr>
+                    <pic:cNvPr id="0" name="Picture 3"/>
+                    <pic:cNvPicPr>
+                      <a:picLocks noChangeAspect="1" noChangeArrowheads="1"/>
+                    </pic:cNvPicPr>
+                  </pic:nvPicPr>
+                  <pic:blipFill rotWithShape="1">
+                    <a:blip r:embed="rId8">
+                      <a:extLst>
+                        <a:ext uri="{28A0092B-C50C-407E-A947-70E740481C1C}">
+                          <a14:useLocalDpi xmlns:a14="http://schemas.microsoft.com/office/drawing/2010/main" val="0"/>
+                        </a:ext>
+                      </a:extLst>
+                    </a:blip>
+                    <a:srcRect l="10030" t="18716" r="38826" b="54944"/>
+                    <a:stretch/>
+                  </pic:blipFill>
+                  <pic:spPr bwMode="auto">
+                    <a:xfrm>
+                      <a:off x="0" y="0"/>
+                      <a:ext cx="3498474" cy="1012978"/>
+                    </a:xfrm>
+                    <a:prstGeom prst="rect">
+                      <a:avLst/>
+                    </a:prstGeom>
+                    <a:noFill/>
+                    <a:ln>
+                      <a:noFill/>
+                    </a:ln>
+                    <a:extLst>
+                      <a:ext uri="{53640926-AAD7-44D8-BBD7-CCE9431645EC}">
+                        <a14:shadowObscured xmlns:a14="http://schemas.microsoft.com/office/drawing/2010/main"/>
+                      </a:ext>
+                    </a:extLst>
+                  </pic:spPr>
+                </pic:pic>
+              </a:graphicData>
+            </a:graphic>
+          </wp:inline>
+        </w:drawing>
+      </w:r>
+    </w:p>
+    <w:p>
+      <w:r>
+        <w:rPr>
+          <w:b/>
+          <w:bCs/>
+          <w:i/>
+          <w:iCs/>
+          <w:sz w:val="24"/>
+          <w:szCs w:val="24"/>
+        </w:rPr>
+        <w:t xml:space="preserve">3. Instalación de </w:t>
+      </w:r>
+      <w:proofErr w:type="spellStart"/>
+      <w:r>
+        <w:rPr>
+          <w:b/>
+          <w:bCs/>
+          <w:i/>
+          <w:iCs/>
+          <w:sz w:val="24"/>
+          <w:szCs w:val="24"/>
+        </w:rPr>
+        <w:t>bids-mapper</w:t>
+      </w:r>
+      <w:proofErr w:type="spellEnd"/>
+      <w:r>
+        <w:br/>
+        <w:t xml:space="preserve">Se instaló la herramienta </w:t>
+      </w:r>
+      <w:proofErr w:type="spellStart"/>
+      <w:r>
+        <w:t>bids-mapper</w:t>
+      </w:r>
+      <w:proofErr w:type="spellEnd"/>
+      <w:r>
+        <w:t>, que facilita la creación de un esquema inicial de mapeo de archivos DICOM hacia BIDS.</w:t>
+      </w:r>
+    </w:p>
+    <w:p>
+      <w:pPr>
+        <w:ind w:firstLine="708"/>
+        <w:rPr>
+          <w:i/>
+          <w:iCs/>
+        </w:rPr>
+      </w:pPr>
+      <w:proofErr w:type="spellStart"/>
+      <w:r>
+        <w:rPr>
+          <w:i/>
+          <w:iCs/>
+        </w:rPr>
+        <w:t>pip</w:t>
+      </w:r>
+      <w:proofErr w:type="spellEnd"/>
+      <w:r>
+        <w:rPr>
+          <w:i/>
+          <w:iCs/>
+        </w:rPr>
+        <w:t xml:space="preserve"> </w:t>
+      </w:r>
+      <w:proofErr w:type="spellStart"/>
+      <w:r>
+        <w:rPr>
+          <w:i/>
+          <w:iCs/>
+        </w:rPr>
+        <w:t>install</w:t>
+      </w:r>
+      <w:proofErr w:type="spellEnd"/>
+      <w:r>
+        <w:rPr>
+          <w:i/>
+          <w:iCs/>
+        </w:rPr>
+        <w:t xml:space="preserve"> </w:t>
+      </w:r>
+      <w:proofErr w:type="spellStart"/>
+      <w:r>
+        <w:rPr>
+          <w:i/>
+          <w:iCs/>
+        </w:rPr>
+        <w:t>bids-mapper</w:t>
+      </w:r>
+      <w:proofErr w:type="spellEnd"/>
+    </w:p>
+    <w:p>
+      <w:r>
+        <w:rPr>
+          <w:b/>
+          <w:bCs/>
+          <w:i/>
+          <w:iCs/>
+          <w:sz w:val="24"/>
+          <w:szCs w:val="24"/>
+        </w:rPr>
+        <w:t xml:space="preserve">4. Generación del mapeo con </w:t>
+      </w:r>
+      <w:proofErr w:type="spellStart"/>
+      <w:r>
+        <w:rPr>
+          <w:b/>
+          <w:bCs/>
+          <w:i/>
+          <w:iCs/>
+          <w:sz w:val="24"/>
+          <w:szCs w:val="24"/>
+        </w:rPr>
+        <w:t>bidsmapper</w:t>
+      </w:r>
+      <w:proofErr w:type="spellEnd"/>
+      <w:r>
+        <w:br/>
+        <w:t xml:space="preserve">Desde la carpeta DATA, se ejecutó el siguiente comando para generar el archivo de configuración </w:t>
+      </w:r>
+      <w:proofErr w:type="spellStart"/>
+      <w:r>
+        <w:t>bidsmap</w:t>
+      </w:r>
+      <w:proofErr w:type="spellEnd"/>
+      <w:r>
+        <w:t>:</w:t>
+      </w:r>
+    </w:p>
+    <w:p>
+      <w:pPr>
+        <w:ind w:firstLine="708"/>
+        <w:rPr>
+          <w:i/>
+          <w:iCs/>
+        </w:rPr>
+      </w:pPr>
+      <w:proofErr w:type="spellStart"/>
+      <w:r>
+        <w:rPr>
+          <w:i/>
+          <w:iCs/>
+        </w:rPr>
+        <w:t>bidsmapper</w:t>
+      </w:r>
+      <w:proofErr w:type="spellEnd"/>
+      <w:r>
+        <w:rPr>
+          <w:i/>
+          <w:iCs/>
+        </w:rPr>
+        <w:t xml:space="preserve"> "ruta/a/raw" "ruta/a/BIDS"</w:t>
+      </w:r>
+    </w:p>
+    <w:p>
+      <w:r>
+        <w:t>Ejemplo:</w:t>
+      </w:r>
+    </w:p>
+    <w:p>
+      <w:pPr>
+        <w:ind w:firstLine="708"/>
+        <w:rPr>
+          <w:i/>
+          <w:iCs/>
+        </w:rPr>
+      </w:pPr>
+      <w:proofErr w:type="spellStart"/>
+      <w:r>
+        <w:rPr>
+          <w:i/>
+          <w:iCs/>
+        </w:rPr>
+        <w:t>bidsmapper</w:t>
+      </w:r>
+      <w:proofErr w:type="spellEnd"/>
+      <w:r>
+        <w:rPr>
+          <w:i/>
+          <w:iCs/>
+        </w:rPr>
+        <w:t xml:space="preserve"> "C:\...\DATA\raw" "C:\...\DATA\BIDS"</w:t>
+      </w:r>
+    </w:p>
+    <w:p>
+      <w:pPr>
+        <w:ind w:firstLine="708"/>
+        <w:jc w:val="center"/>
+        <w:rPr>
+          <w:i/>
+          <w:iCs/>
+        </w:rPr>
+      </w:pPr>
+      <w:r>
+        <w:rPr>
+          <w:i/>
+          <w:iCs/>
+          <w:noProof/>
+        </w:rPr>
+        <w:drawing>
+          <wp:inline distT="0" distB="0" distL="0" distR="0" wp14:anchorId="04499511" wp14:editId="492B3CDE">
+            <wp:extent cx="3881409" cy="2159779"/>
+            <wp:effectExtent l="0" t="0" r="5080" b="0"/>
+            <wp:docPr id="752358604" name="Imagen 3"/>
+            <wp:cNvGraphicFramePr>
+              <a:graphicFrameLocks xmlns:a="http://schemas.openxmlformats.org/drawingml/2006/main" noChangeAspect="1"/>
+            </wp:cNvGraphicFramePr>
+            <a:graphic xmlns:a="http://schemas.openxmlformats.org/drawingml/2006/main">
+              <a:graphicData uri="http://schemas.openxmlformats.org/drawingml/2006/picture">
+                <pic:pic xmlns:pic="http://schemas.openxmlformats.org/drawingml/2006/picture">
+                  <pic:nvPicPr>
+                    <pic:cNvPr id="0" name="Picture 4"/>
+                    <pic:cNvPicPr>
+                      <a:picLocks noChangeAspect="1" noChangeArrowheads="1"/>
+                    </pic:cNvPicPr>
+                  </pic:nvPicPr>
+                  <pic:blipFill rotWithShape="1">
+                    <a:blip r:embed="rId9" cstate="print">
+                      <a:extLst>
+                        <a:ext uri="{28A0092B-C50C-407E-A947-70E740481C1C}">
+                          <a14:useLocalDpi xmlns:a14="http://schemas.microsoft.com/office/drawing/2010/main" val="0"/>
+                        </a:ext>
+                      </a:extLst>
+                    </a:blip>
+                    <a:srcRect r="27158" b="26060"/>
+                    <a:stretch/>
+                  </pic:blipFill>
+                  <pic:spPr bwMode="auto">
+                    <a:xfrm>
+                      <a:off x="0" y="0"/>
+                      <a:ext cx="3906183" cy="2173564"/>
+                    </a:xfrm>
+                    <a:prstGeom prst="rect">
+                      <a:avLst/>
+                    </a:prstGeom>
+                    <a:noFill/>
+                    <a:ln>
+                      <a:noFill/>
+                    </a:ln>
+                    <a:extLst>
+                      <a:ext uri="{53640926-AAD7-44D8-BBD7-CCE9431645EC}">
+                        <a14:shadowObscured xmlns:a14="http://schemas.microsoft.com/office/drawing/2010/main"/>
+                      </a:ext>
+                    </a:extLst>
+                  </pic:spPr>
+                </pic:pic>
+              </a:graphicData>
+            </a:graphic>
+          </wp:inline>
+        </w:drawing>
+      </w:r>
+    </w:p>
+    <w:p>
+      <w:r>
+        <w:t>Este proceso crea una estructura inicial de mapeo, que luego se edita manualmente según el tipo de adquisición (por ejemplo, anatómica —</w:t>
+      </w:r>
+      <w:proofErr w:type="spellStart"/>
+      <w:r>
+        <w:t>anat</w:t>
+      </w:r>
+      <w:proofErr w:type="spellEnd"/>
+      <w:r>
+        <w:t>—), eliminando campos innecesarios como el identificador de adquisición (</w:t>
+      </w:r>
+      <w:proofErr w:type="spellStart"/>
+      <w:r>
+        <w:t>acq</w:t>
+      </w:r>
+      <w:proofErr w:type="spellEnd"/>
+      <w:r>
+        <w:t>-) y asegurando que el sufijo (por ejemplo, T1w) sea correcto. Cuando la interfaz indica en color verde, se interpreta que el mapeo está completo y es válido.</w:t>
+      </w:r>
+    </w:p>
+    <w:p>
+      <w:pPr>
+        <w:jc w:val="center"/>
+      </w:pPr>
+      <w:r>
+        <w:rPr>
+          <w:noProof/>
+        </w:rPr>
+        <w:lastRenderedPageBreak/>
+        <mc:AlternateContent>
+          <mc:Choice Requires="wps">
+            <w:drawing>
+              <wp:inline distT="0" distB="0" distL="0" distR="0" wp14:anchorId="2D8FBEB4" wp14:editId="5C61CBE8">
+                <wp:extent cx="302895" cy="302895"/>
+                <wp:effectExtent l="0" t="0" r="0" b="0"/>
+                <wp:docPr id="1317075156" name="Rectángulo 4"/>
+                <wp:cNvGraphicFramePr>
+                  <a:graphicFrameLocks xmlns:a="http://schemas.openxmlformats.org/drawingml/2006/main" noChangeAspect="1"/>
+                </wp:cNvGraphicFramePr>
+                <a:graphic xmlns:a="http://schemas.openxmlformats.org/drawingml/2006/main">
+                  <a:graphicData uri="http://schemas.microsoft.com/office/word/2010/wordprocessingShape">
+                    <wps:wsp>
+                      <wps:cNvSpPr>
+                        <a:spLocks noChangeAspect="1" noChangeArrowheads="1"/>
+                      </wps:cNvSpPr>
+                      <wps:spPr bwMode="auto">
+                        <a:xfrm>
+                          <a:off x="0" y="0"/>
+                          <a:ext cx="302895" cy="302895"/>
+                        </a:xfrm>
+                        <a:prstGeom prst="rect">
+                          <a:avLst/>
+                        </a:prstGeom>
+                        <a:noFill/>
+                        <a:ln>
+                          <a:noFill/>
+                        </a:ln>
+                        <a:extLst>
+                          <a:ext uri="{909E8E84-426E-40DD-AFC4-6F175D3DCCD1}">
+                            <a14:hiddenFill xmlns:a14="http://schemas.microsoft.com/office/drawing/2010/main">
+                              <a:solidFill>
+                                <a:srgbClr val="FFFFFF"/>
+                              </a:solidFill>
+                            </a14:hiddenFill>
+                          </a:ext>
+                          <a:ext uri="{91240B29-F687-4F45-9708-019B960494DF}">
+                            <a14:hiddenLine xmlns:a14="http://schemas.microsoft.com/office/drawing/2010/main" w="9525">
+                              <a:solidFill>
+                                <a:srgbClr val="000000"/>
+                              </a:solidFill>
+                              <a:miter lim="800000"/>
+                              <a:headEnd/>
+                              <a:tailEnd/>
+                            </a14:hiddenLine>
+                          </a:ext>
+                        </a:extLst>
+                      </wps:spPr>
+                      <wps:bodyPr rot="0" vert="horz" wrap="square" lIns="91440" tIns="45720" rIns="91440" bIns="45720" anchor="t" anchorCtr="0" upright="1">
+                        <a:noAutofit/>
+                      </wps:bodyPr>
+                    </wps:wsp>
+                  </a:graphicData>
+                </a:graphic>
+              </wp:inline>
+            </w:drawing>
+          </mc:Choice>
+          <mc:Fallback>
+            <w:pict>
+              <v:rect w14:anchorId="2DFE9F13" id="Rectángulo 4" o:spid="_x0000_s1026" style="width:23.85pt;height:23.85pt;visibility:visible;mso-wrap-style:square;mso-left-percent:-10001;mso-top-percent:-10001;mso-position-horizontal:absolute;mso-position-horizontal-relative:char;mso-position-vertical:absolute;mso-position-vertical-relative:line;mso-left-percent:-10001;mso-top-percent:-10001;v-text-anchor:top" o:gfxdata="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" filled="f" stroked="f">
+                <o:lock v:ext="edit" aspectratio="t"/>
+                <w10:anchorlock/>
+              </v:rect>
+            </w:pict>
+          </mc:Fallback>
+        </mc:AlternateContent>
+      </w:r>
+      <w:r>
+        <w:rPr>
+          <w:noProof/>
+        </w:rPr>
+        <w:drawing>
+          <wp:inline distT="0" distB="0" distL="0" distR="0" wp14:anchorId="2FCF509B" wp14:editId="6C7D1C31">
+            <wp:extent cx="2433320" cy="1844980"/>
+            <wp:effectExtent l="0" t="0" r="5080" b="3175"/>
+            <wp:docPr id="1024358219" name="Imagen 5"/>
+            <wp:cNvGraphicFramePr>
+              <a:graphicFrameLocks xmlns:a="http://schemas.openxmlformats.org/drawingml/2006/main" noChangeAspect="1"/>
+            </wp:cNvGraphicFramePr>
+            <a:graphic xmlns:a="http://schemas.openxmlformats.org/drawingml/2006/main">
+              <a:graphicData uri="http://schemas.openxmlformats.org/drawingml/2006/picture">
+                <pic:pic xmlns:pic="http://schemas.openxmlformats.org/drawingml/2006/picture">
+                  <pic:nvPicPr>
+                    <pic:cNvPr id="0" name="Picture 5"/>
+                    <pic:cNvPicPr>
+                      <a:picLocks noChangeAspect="1" noChangeArrowheads="1"/>
+                    </pic:cNvPicPr>
+                  </pic:nvPicPr>
+                  <pic:blipFill rotWithShape="1">
+                    <a:blip r:embed="rId10" cstate="print">
+                      <a:extLst>
+                        <a:ext uri="{28A0092B-C50C-407E-A947-70E740481C1C}">
+                          <a14:useLocalDpi xmlns:a14="http://schemas.microsoft.com/office/drawing/2010/main" val="0"/>
+                        </a:ext>
+                      </a:extLst>
+                    </a:blip>
+                    <a:srcRect l="15648" t="4865" r="18445" b="6253"/>
+                    <a:stretch/>
+                  </pic:blipFill>
+                  <pic:spPr bwMode="auto">
+                    <a:xfrm>
+                      <a:off x="0" y="0"/>
+                      <a:ext cx="2456610" cy="1862639"/>
+                    </a:xfrm>
+                    <a:prstGeom prst="rect">
+                      <a:avLst/>
+                    </a:prstGeom>
+                    <a:noFill/>
+                    <a:ln>
+                      <a:noFill/>
+                    </a:ln>
+                    <a:extLst>
+                      <a:ext uri="{53640926-AAD7-44D8-BBD7-CCE9431645EC}">
+                        <a14:shadowObscured xmlns:a14="http://schemas.microsoft.com/office/drawing/2010/main"/>
+                      </a:ext>
+                    </a:extLst>
+                  </pic:spPr>
+                </pic:pic>
+              </a:graphicData>
+            </a:graphic>
+          </wp:inline>
+        </w:drawing>
+      </w:r>
+    </w:p>
+    <w:p>
+      <w:r>
+        <w:rPr>
+          <w:b/>
+          <w:bCs/>
+          <w:i/>
+          <w:iCs/>
+          <w:sz w:val="24"/>
+          <w:szCs w:val="24"/>
+        </w:rPr>
+        <w:t>5. Instalación y configuración de dcm2niix</w:t>
+      </w:r>
+      <w:r>
+        <w:br/>
+        <w:t xml:space="preserve">Para convertir archivos DICOM a </w:t>
+      </w:r>
+      <w:proofErr w:type="spellStart"/>
+      <w:r>
+        <w:t>NIfTI</w:t>
+      </w:r>
+      <w:proofErr w:type="spellEnd"/>
+      <w:r>
+        <w:t xml:space="preserve"> (.</w:t>
+      </w:r>
+      <w:proofErr w:type="spellStart"/>
+      <w:r>
+        <w:t>nii</w:t>
+      </w:r>
+      <w:proofErr w:type="spellEnd"/>
+      <w:r>
+        <w:t>), se utilizó la herramienta dcm2niix. Se descargó y se configuró en el sistema mediante los siguientes pasos:</w:t>
+      </w:r>
+      <w:r>
+        <w:br/>
+      </w:r>
+      <w:r>
+        <w:t xml:space="preserve">- </w:t>
+      </w:r>
+      <w:r>
+        <w:t xml:space="preserve">Presionar Windows + R, escribir </w:t>
+      </w:r>
+      <w:proofErr w:type="spellStart"/>
+      <w:r>
+        <w:t>sysdm.cpl</w:t>
+      </w:r>
+      <w:proofErr w:type="spellEnd"/>
+      <w:r>
+        <w:t xml:space="preserve"> y presionar </w:t>
+      </w:r>
+      <w:proofErr w:type="spellStart"/>
+      <w:r>
+        <w:t>Enter</w:t>
+      </w:r>
+      <w:proofErr w:type="spellEnd"/>
+      <w:r>
+        <w:t>.</w:t>
+      </w:r>
+      <w:r>
+        <w:br/>
+      </w:r>
+      <w:r>
+        <w:t xml:space="preserve">- </w:t>
+      </w:r>
+      <w:r>
+        <w:t>Ir a la pestaña Opciones avanzadas y hacer clic en Variables de entorno.</w:t>
+      </w:r>
+      <w:r>
+        <w:br/>
+      </w:r>
+      <w:r>
+        <w:t xml:space="preserve">- </w:t>
+      </w:r>
+      <w:r>
+        <w:t xml:space="preserve">En Variables del sistema, seleccionar </w:t>
+      </w:r>
+      <w:proofErr w:type="spellStart"/>
+      <w:r>
+        <w:t>Path</w:t>
+      </w:r>
+      <w:proofErr w:type="spellEnd"/>
+      <w:r>
+        <w:t>, hacer clic en Editar, y agregar la ruta de la carpeta donde se encuentra el ejecutable de dcm2niix.</w:t>
+      </w:r>
+    </w:p>
+    <w:p>
+      <w:r>
+        <w:rPr>
+          <w:b/>
+          <w:bCs/>
+          <w:i/>
+          <w:iCs/>
+          <w:sz w:val="24"/>
+          <w:szCs w:val="24"/>
+        </w:rPr>
+        <w:t xml:space="preserve">6. Conversión final con </w:t>
+      </w:r>
+      <w:proofErr w:type="spellStart"/>
+      <w:r>
+        <w:rPr>
+          <w:b/>
+          <w:bCs/>
+          <w:i/>
+          <w:iCs/>
+          <w:sz w:val="24"/>
+          <w:szCs w:val="24"/>
+        </w:rPr>
+        <w:t>bidscoiner</w:t>
+      </w:r>
+      <w:proofErr w:type="spellEnd"/>
+      <w:r>
+        <w:br/>
+        <w:t xml:space="preserve">Finalmente, se utilizó la herramienta </w:t>
+      </w:r>
+      <w:proofErr w:type="spellStart"/>
+      <w:r>
+        <w:t>bidscoiner</w:t>
+      </w:r>
+      <w:proofErr w:type="spellEnd"/>
+      <w:r>
+        <w:t xml:space="preserve"> para aplicar el mapeo generado y convertir los archivos al formato BIDS estructurado:</w:t>
+      </w:r>
+    </w:p>
+    <w:p>
+      <w:pPr>
+        <w:ind w:firstLine="708"/>
+        <w:rPr>
+          <w:i/>
+          <w:iCs/>
+        </w:rPr>
+      </w:pPr>
+      <w:proofErr w:type="spellStart"/>
+      <w:r>
+        <w:rPr>
+          <w:i/>
+          <w:iCs/>
+        </w:rPr>
+        <w:t>bidscoiner</w:t>
+      </w:r>
+      <w:proofErr w:type="spellEnd"/>
+      <w:r>
+        <w:rPr>
+          <w:i/>
+          <w:iCs/>
+        </w:rPr>
+        <w:t xml:space="preserve"> -p "</w:t>
+      </w:r>
+      <w:proofErr w:type="spellStart"/>
+      <w:r>
+        <w:rPr>
+          <w:i/>
+          <w:iCs/>
+        </w:rPr>
+        <w:t>identificador_sujeto</w:t>
+      </w:r>
+      <w:proofErr w:type="spellEnd"/>
+      <w:r>
+        <w:rPr>
+          <w:i/>
+          <w:iCs/>
+        </w:rPr>
+        <w:t>" -b "ruta/a/</w:t>
+      </w:r>
+      <w:proofErr w:type="spellStart"/>
+      <w:r>
+        <w:rPr>
+          <w:i/>
+          <w:iCs/>
+        </w:rPr>
+        <w:t>bidsmap</w:t>
+      </w:r>
+      <w:proofErr w:type="spellEnd"/>
+      <w:r>
+        <w:rPr>
+          <w:i/>
+          <w:iCs/>
+        </w:rPr>
+        <w:t>" raw BIDS</w:t>
+      </w:r>
+    </w:p>
+    <w:p>
+      <w:r>
+        <w:t>Ejemplo:</w:t>
+      </w:r>
+    </w:p>
+    <w:p>
+      <w:pPr>
+        <w:ind w:firstLine="708"/>
+        <w:rPr>
+          <w:i/>
+          <w:iCs/>
+        </w:rPr>
+      </w:pPr>
+      <w:proofErr w:type="spellStart"/>
+      <w:r>
+        <w:rPr>
+          <w:i/>
+          <w:iCs/>
+        </w:rPr>
+        <w:t>bidscoiner</w:t>
+      </w:r>
+      <w:proofErr w:type="spellEnd"/>
+      <w:r>
+        <w:rPr>
+          <w:i/>
+          <w:iCs/>
+        </w:rPr>
+        <w:t xml:space="preserve"> -p "0001" -b "C:\...\DATA\BIDS\code\bidscoin\bidsmap" raw BIDS</w:t>
+      </w:r>
+    </w:p>
+    <w:p>
+      <w:r>
+        <w:t>Este comando convierte los datos del sujeto 0001 (ubicados en la carpeta raw) y los organiza en la carpeta BIDS de acuerdo con el mapeo especificado.</w:t>
+      </w:r>
+    </w:p>
+    <w:p>
+      <w:pPr>
+        <w:rPr>
+          <w:b/>
+          <w:bCs/>
+          <w:i/>
+          <w:iCs/>
+          <w:sz w:val="24"/>
+          <w:szCs w:val="24"/>
+        </w:rPr>
+      </w:pPr>
+      <w:r>
+        <w:rPr>
+          <w:b/>
+          <w:bCs/>
+          <w:i/>
+          <w:iCs/>
+          <w:sz w:val="24"/>
+          <w:szCs w:val="24"/>
+        </w:rPr>
+        <w:t>7</w:t>
+      </w:r>
+      <w:r>
+        <w:rPr>
+          <w:b/>
+          <w:bCs/>
+          <w:i/>
+          <w:iCs/>
+          <w:sz w:val="24"/>
+          <w:szCs w:val="24"/>
+        </w:rPr>
+        <w:t>. R</w:t>
+      </w:r>
+      <w:r>
+        <w:rPr>
+          <w:b/>
+          <w:bCs/>
+          <w:i/>
+          <w:iCs/>
+          <w:sz w:val="24"/>
+          <w:szCs w:val="24"/>
+        </w:rPr>
+        <w:t>epetibilidad</w:t>
+      </w:r>
+      <w:r>
+        <w:rPr>
+          <w:b/>
+          <w:bCs/>
+          <w:i/>
+          <w:iCs/>
+          <w:sz w:val="24"/>
+          <w:szCs w:val="24"/>
+        </w:rPr>
+        <w:t xml:space="preserve"> del </w:t>
+      </w:r>
+      <w:r>
+        <w:rPr>
+          <w:b/>
+          <w:bCs/>
+          <w:i/>
+          <w:iCs/>
+          <w:sz w:val="24"/>
+          <w:szCs w:val="24"/>
+        </w:rPr>
+        <w:t>Proceso</w:t>
+      </w:r>
+    </w:p>
+    <w:p>
+      <w:r>
+        <w:t xml:space="preserve">Se realizara este proceso para todos los sujetos para obtener el </w:t>
+      </w:r>
+      <w:r>
+        <w:t>estándar</w:t>
+      </w:r>
+      <w:r>
+        <w:t xml:space="preserve"> BIDS</w:t>
+      </w:r>
+    </w:p>
+    <w:p>
+      <w:pPr>
+        <w:jc w:val="center"/>
+      </w:pPr>
+      <w:r>
+        <w:rPr>
+          <w:noProof/>
+        </w:rPr>
+        <w:drawing>
+          <wp:inline distT="0" distB="0" distL="0" distR="0" wp14:anchorId="0135A780" wp14:editId="0B3B2E5B">
+            <wp:extent cx="1912680" cy="790848"/>
+            <wp:effectExtent l="0" t="0" r="0" b="9525"/>
+            <wp:docPr id="337233495" name="Imagen 7"/>
+            <wp:cNvGraphicFramePr>
+              <a:graphicFrameLocks xmlns:a="http://schemas.openxmlformats.org/drawingml/2006/main" noChangeAspect="1"/>
+            </wp:cNvGraphicFramePr>
+            <a:graphic xmlns:a="http://schemas.openxmlformats.org/drawingml/2006/main">
+              <a:graphicData uri="http://schemas.openxmlformats.org/drawingml/2006/picture">
+                <pic:pic xmlns:pic="http://schemas.openxmlformats.org/drawingml/2006/picture">
+                  <pic:nvPicPr>
+                    <pic:cNvPr id="0" name="Picture 6"/>
+                    <pic:cNvPicPr>
+                      <a:picLocks noChangeAspect="1" noChangeArrowheads="1"/>
+                    </pic:cNvPicPr>
+                  </pic:nvPicPr>
+                  <pic:blipFill rotWithShape="1">
+                    <a:blip r:embed="rId11" cstate="print">
+                      <a:extLst>
+                        <a:ext uri="{28A0092B-C50C-407E-A947-70E740481C1C}">
+                          <a14:useLocalDpi xmlns:a14="http://schemas.microsoft.com/office/drawing/2010/main" val="0"/>
+                        </a:ext>
+                      </a:extLst>
+                    </a:blip>
+                    <a:srcRect l="10375" t="18723" r="37607" b="43022"/>
+                    <a:stretch/>
+                  </pic:blipFill>
+                  <pic:spPr bwMode="auto">
+                    <a:xfrm>
+                      <a:off x="0" y="0"/>
+                      <a:ext cx="1928992" cy="797593"/>
+                    </a:xfrm>
+                    <a:prstGeom prst="rect">
+                      <a:avLst/>
+                    </a:prstGeom>
+                    <a:noFill/>
+                    <a:ln>
+                      <a:noFill/>
+                    </a:ln>
+                    <a:extLst>
+                      <a:ext uri="{53640926-AAD7-44D8-BBD7-CCE9431645EC}">
+                        <a14:shadowObscured xmlns:a14="http://schemas.microsoft.com/office/drawing/2010/main"/>
+                      </a:ext>
+                    </a:extLst>
+                  </pic:spPr>
+                </pic:pic>
+              </a:graphicData>
+            </a:graphic>
+          </wp:inline>
+        </w:drawing>
       </w:r>
     </w:p>
     <w:p>
@@ -322,7 +1415,7 @@
     </w:p>
     <w:p/>
     <w:sectPr>
-      <w:headerReference w:type="default" r:id="rId6"/>
+      <w:headerReference w:type="default" r:id="rId12"/>
       <w:pgSz w:w="12240" w:h="15840"/>
       <w:pgMar w:top="1417" w:right="1701" w:bottom="1417" w:left="1701" w:header="708" w:footer="708" w:gutter="0"/>
       <w:cols w:space="708"/>
@@ -389,9 +1482,6 @@
       <w:pStyle w:val="Encabezado"/>
     </w:pPr>
     <w:r>
-      <w:rPr>
-        <w:noProof/>
-      </w:rPr>
       <w:drawing>
         <wp:anchor distT="0" distB="0" distL="114300" distR="114300" simplePos="0" relativeHeight="251659264" behindDoc="1" locked="0" layoutInCell="1" allowOverlap="1" wp14:anchorId="403D06D3" wp14:editId="00846334">
           <wp:simplePos x="0" y="0"/>
@@ -450,6 +1540,406 @@
     </w:r>
   </w:p>
 </w:hdr>
+</file>
+
+<file path=word/numbering.xml><?xml version="1.0" encoding="utf-8"?>
+<w:numbering xmlns:wpc="http://schemas.microsoft.com/office/word/2010/wordprocessingCanvas" xmlns:cx="http://schemas.microsoft.com/office/drawing/2014/chartex" xmlns:cx1="http://schemas.microsoft.com/office/drawing/2015/9/8/chartex" xmlns:cx2="http://schemas.microsoft.com/office/drawing/2015/10/21/chartex" xmlns:cx3="http://schemas.microsoft.com/office/drawing/2016/5/9/chartex" xmlns:cx4="http://schemas.microsoft.com/office/drawing/2016/5/10/chartex" xmlns:cx5="http://schemas.microsoft.com/office/drawing/2016/5/11/chartex" xmlns:cx6="http://schemas.microsoft.com/office/drawing/2016/5/12/chartex" xmlns:cx7="http://schemas.microsoft.com/office/drawing/2016/5/13/chartex" xmlns:cx8="http://schemas.microsoft.com/office/drawing/2016/5/14/chartex" xmlns:mc="http://schemas.openxmlformats.org/markup-compatibility/2006" xmlns:aink="http://schemas.microsoft.com/office/drawing/2016/ink" xmlns:am3d="http://schemas.microsoft.com/office/drawing/2017/model3d" xmlns:o="urn:schemas-microsoft-com:office:office" xmlns:oel="http://schemas.microsoft.com/office/2019/extlst" xmlns:r="http://schemas.openxmlformats.org/officeDocument/2006/relationships" xmlns:m="http://schemas.openxmlformats.org/officeDocument/2006/math" xmlns:v="urn:schemas-microsoft-com:vml" xmlns:wp14="http://schemas.microsoft.com/office/word/2010/wordprocessingDrawing" xmlns:wp="http://schemas.openxmlformats.org/drawingml/2006/wordprocessingDrawing" xmlns:w10="urn:schemas-microsoft-com:office:word" xmlns:w="http://schemas.openxmlformats.org/wordprocessingml/2006/main" xmlns:w14="http://schemas.microsoft.com/office/word/2010/wordml" xmlns:w15="http://schemas.microsoft.com/office/word/2012/wordml" xmlns:w16cex="http://schemas.microsoft.com/office/word/2018/wordml/cex" xmlns:w16cid="http://schemas.microsoft.com/office/word/2016/wordml/cid" xmlns:w16="http://schemas.microsoft.com/office/word/2018/wordml" xmlns:w16du="http://schemas.microsoft.com/office/word/2023/wordml/word16du" xmlns:w16sdtdh="http://schemas.microsoft.com/office/word/2020/wordml/sdtdatahash" xmlns:w16sdtfl="http://schemas.microsoft.com/office/word/2024/wordml/sdtformatlock" xmlns:w16se="http://schemas.microsoft.com/office/word/2015/wordml/symex" xmlns:wpg="http://schemas.microsoft.com/office/word/2010/wordprocessingGroup" xmlns:wpi="http://schemas.microsoft.com/office/word/2010/wordprocessingInk" xmlns:wne="http://schemas.microsoft.com/office/word/2006/wordml" xmlns:wps="http://schemas.microsoft.com/office/word/2010/wordprocessingShape" mc:Ignorable="w14 w15 w16se w16cid w16 w16cex w16sdtdh w16sdtfl w16du wp14">
+  <w:abstractNum w:abstractNumId="0" w15:restartNumberingAfterBreak="0">
+    <w:nsid w:val="189C5543"/>
+    <w:multiLevelType w:val="hybridMultilevel"/>
+    <w:tmpl w:val="2C3C5CF6"/>
+    <w:lvl w:ilvl="0" w:tplc="6910293C">
+      <w:start w:val="1"/>
+      <w:numFmt w:val="decimal"/>
+      <w:lvlText w:val="%1."/>
+      <w:lvlJc w:val="left"/>
+      <w:pPr>
+        <w:ind w:left="360" w:hanging="360"/>
+      </w:pPr>
+      <w:rPr>
+        <w:rFonts w:hint="default"/>
+        <w:b/>
+        <w:i/>
+        <w:sz w:val="24"/>
+      </w:rPr>
+    </w:lvl>
+    <w:lvl w:ilvl="1" w:tplc="240A0019" w:tentative="1">
+      <w:start w:val="1"/>
+      <w:numFmt w:val="lowerLetter"/>
+      <w:lvlText w:val="%2."/>
+      <w:lvlJc w:val="left"/>
+      <w:pPr>
+        <w:ind w:left="1080" w:hanging="360"/>
+      </w:pPr>
+    </w:lvl>
+    <w:lvl w:ilvl="2" w:tplc="240A001B" w:tentative="1">
+      <w:start w:val="1"/>
+      <w:numFmt w:val="lowerRoman"/>
+      <w:lvlText w:val="%3."/>
+      <w:lvlJc w:val="right"/>
+      <w:pPr>
+        <w:ind w:left="1800" w:hanging="180"/>
+      </w:pPr>
+    </w:lvl>
+    <w:lvl w:ilvl="3" w:tplc="240A000F" w:tentative="1">
+      <w:start w:val="1"/>
+      <w:numFmt w:val="decimal"/>
+      <w:lvlText w:val="%4."/>
+      <w:lvlJc w:val="left"/>
+      <w:pPr>
+        <w:ind w:left="2520" w:hanging="360"/>
+      </w:pPr>
+    </w:lvl>
+    <w:lvl w:ilvl="4" w:tplc="240A0019" w:tentative="1">
+      <w:start w:val="1"/>
+      <w:numFmt w:val="lowerLetter"/>
+      <w:lvlText w:val="%5."/>
+      <w:lvlJc w:val="left"/>
+      <w:pPr>
+        <w:ind w:left="3240" w:hanging="360"/>
+      </w:pPr>
+    </w:lvl>
+    <w:lvl w:ilvl="5" w:tplc="240A001B" w:tentative="1">
+      <w:start w:val="1"/>
+      <w:numFmt w:val="lowerRoman"/>
+      <w:lvlText w:val="%6."/>
+      <w:lvlJc w:val="right"/>
+      <w:pPr>
+        <w:ind w:left="3960" w:hanging="180"/>
+      </w:pPr>
+    </w:lvl>
+    <w:lvl w:ilvl="6" w:tplc="240A000F" w:tentative="1">
+      <w:start w:val="1"/>
+      <w:numFmt w:val="decimal"/>
+      <w:lvlText w:val="%7."/>
+      <w:lvlJc w:val="left"/>
+      <w:pPr>
+        <w:ind w:left="4680" w:hanging="360"/>
+      </w:pPr>
+    </w:lvl>
+    <w:lvl w:ilvl="7" w:tplc="240A0019" w:tentative="1">
+      <w:start w:val="1"/>
+      <w:numFmt w:val="lowerLetter"/>
+      <w:lvlText w:val="%8."/>
+      <w:lvlJc w:val="left"/>
+      <w:pPr>
+        <w:ind w:left="5400" w:hanging="360"/>
+      </w:pPr>
+    </w:lvl>
+    <w:lvl w:ilvl="8" w:tplc="240A001B" w:tentative="1">
+      <w:start w:val="1"/>
+      <w:numFmt w:val="lowerRoman"/>
+      <w:lvlText w:val="%9."/>
+      <w:lvlJc w:val="right"/>
+      <w:pPr>
+        <w:ind w:left="6120" w:hanging="180"/>
+      </w:pPr>
+    </w:lvl>
+  </w:abstractNum>
+  <w:abstractNum w:abstractNumId="1" w15:restartNumberingAfterBreak="0">
+    <w:nsid w:val="21125BD1"/>
+    <w:multiLevelType w:val="hybridMultilevel"/>
+    <w:tmpl w:val="C6BCB078"/>
+    <w:lvl w:ilvl="0" w:tplc="240A0001">
+      <w:start w:val="1"/>
+      <w:numFmt w:val="bullet"/>
+      <w:lvlText w:val=""/>
+      <w:lvlJc w:val="left"/>
+      <w:pPr>
+        <w:ind w:left="360" w:hanging="360"/>
+      </w:pPr>
+      <w:rPr>
+        <w:rFonts w:ascii="Symbol" w:hAnsi="Symbol" w:hint="default"/>
+        <w:b/>
+        <w:i/>
+        <w:sz w:val="24"/>
+      </w:rPr>
+    </w:lvl>
+    <w:lvl w:ilvl="1" w:tplc="FFFFFFFF" w:tentative="1">
+      <w:start w:val="1"/>
+      <w:numFmt w:val="lowerLetter"/>
+      <w:lvlText w:val="%2."/>
+      <w:lvlJc w:val="left"/>
+      <w:pPr>
+        <w:ind w:left="1080" w:hanging="360"/>
+      </w:pPr>
+    </w:lvl>
+    <w:lvl w:ilvl="2" w:tplc="FFFFFFFF" w:tentative="1">
+      <w:start w:val="1"/>
+      <w:numFmt w:val="lowerRoman"/>
+      <w:lvlText w:val="%3."/>
+      <w:lvlJc w:val="right"/>
+      <w:pPr>
+        <w:ind w:left="1800" w:hanging="180"/>
+      </w:pPr>
+    </w:lvl>
+    <w:lvl w:ilvl="3" w:tplc="FFFFFFFF" w:tentative="1">
+      <w:start w:val="1"/>
+      <w:numFmt w:val="decimal"/>
+      <w:lvlText w:val="%4."/>
+      <w:lvlJc w:val="left"/>
+      <w:pPr>
+        <w:ind w:left="2520" w:hanging="360"/>
+      </w:pPr>
+    </w:lvl>
+    <w:lvl w:ilvl="4" w:tplc="FFFFFFFF" w:tentative="1">
+      <w:start w:val="1"/>
+      <w:numFmt w:val="lowerLetter"/>
+      <w:lvlText w:val="%5."/>
+      <w:lvlJc w:val="left"/>
+      <w:pPr>
+        <w:ind w:left="3240" w:hanging="360"/>
+      </w:pPr>
+    </w:lvl>
+    <w:lvl w:ilvl="5" w:tplc="FFFFFFFF" w:tentative="1">
+      <w:start w:val="1"/>
+      <w:numFmt w:val="lowerRoman"/>
+      <w:lvlText w:val="%6."/>
+      <w:lvlJc w:val="right"/>
+      <w:pPr>
+        <w:ind w:left="3960" w:hanging="180"/>
+      </w:pPr>
+    </w:lvl>
+    <w:lvl w:ilvl="6" w:tplc="FFFFFFFF" w:tentative="1">
+      <w:start w:val="1"/>
+      <w:numFmt w:val="decimal"/>
+      <w:lvlText w:val="%7."/>
+      <w:lvlJc w:val="left"/>
+      <w:pPr>
+        <w:ind w:left="4680" w:hanging="360"/>
+      </w:pPr>
+    </w:lvl>
+    <w:lvl w:ilvl="7" w:tplc="FFFFFFFF" w:tentative="1">
+      <w:start w:val="1"/>
+      <w:numFmt w:val="lowerLetter"/>
+      <w:lvlText w:val="%8."/>
+      <w:lvlJc w:val="left"/>
+      <w:pPr>
+        <w:ind w:left="5400" w:hanging="360"/>
+      </w:pPr>
+    </w:lvl>
+    <w:lvl w:ilvl="8" w:tplc="FFFFFFFF" w:tentative="1">
+      <w:start w:val="1"/>
+      <w:numFmt w:val="lowerRoman"/>
+      <w:lvlText w:val="%9."/>
+      <w:lvlJc w:val="right"/>
+      <w:pPr>
+        <w:ind w:left="6120" w:hanging="180"/>
+      </w:pPr>
+    </w:lvl>
+  </w:abstractNum>
+  <w:abstractNum w:abstractNumId="2" w15:restartNumberingAfterBreak="0">
+    <w:nsid w:val="26634C5A"/>
+    <w:multiLevelType w:val="hybridMultilevel"/>
+    <w:tmpl w:val="989AB884"/>
+    <w:lvl w:ilvl="0" w:tplc="240A0001">
+      <w:start w:val="1"/>
+      <w:numFmt w:val="bullet"/>
+      <w:lvlText w:val=""/>
+      <w:lvlJc w:val="left"/>
+      <w:pPr>
+        <w:ind w:left="720" w:hanging="360"/>
+      </w:pPr>
+      <w:rPr>
+        <w:rFonts w:ascii="Symbol" w:hAnsi="Symbol" w:hint="default"/>
+      </w:rPr>
+    </w:lvl>
+    <w:lvl w:ilvl="1" w:tplc="240A0003" w:tentative="1">
+      <w:start w:val="1"/>
+      <w:numFmt w:val="bullet"/>
+      <w:lvlText w:val="o"/>
+      <w:lvlJc w:val="left"/>
+      <w:pPr>
+        <w:ind w:left="1440" w:hanging="360"/>
+      </w:pPr>
+      <w:rPr>
+        <w:rFonts w:ascii="Courier New" w:hAnsi="Courier New" w:cs="Courier New" w:hint="default"/>
+      </w:rPr>
+    </w:lvl>
+    <w:lvl w:ilvl="2" w:tplc="240A0005" w:tentative="1">
+      <w:start w:val="1"/>
+      <w:numFmt w:val="bullet"/>
+      <w:lvlText w:val=""/>
+      <w:lvlJc w:val="left"/>
+      <w:pPr>
+        <w:ind w:left="2160" w:hanging="360"/>
+      </w:pPr>
+      <w:rPr>
+        <w:rFonts w:ascii="Wingdings" w:hAnsi="Wingdings" w:hint="default"/>
+      </w:rPr>
+    </w:lvl>
+    <w:lvl w:ilvl="3" w:tplc="240A0001" w:tentative="1">
+      <w:start w:val="1"/>
+      <w:numFmt w:val="bullet"/>
+      <w:lvlText w:val=""/>
+      <w:lvlJc w:val="left"/>
+      <w:pPr>
+        <w:ind w:left="2880" w:hanging="360"/>
+      </w:pPr>
+      <w:rPr>
+        <w:rFonts w:ascii="Symbol" w:hAnsi="Symbol" w:hint="default"/>
+      </w:rPr>
+    </w:lvl>
+    <w:lvl w:ilvl="4" w:tplc="240A0003" w:tentative="1">
+      <w:start w:val="1"/>
+      <w:numFmt w:val="bullet"/>
+      <w:lvlText w:val="o"/>
+      <w:lvlJc w:val="left"/>
+      <w:pPr>
+        <w:ind w:left="3600" w:hanging="360"/>
+      </w:pPr>
+      <w:rPr>
+        <w:rFonts w:ascii="Courier New" w:hAnsi="Courier New" w:cs="Courier New" w:hint="default"/>
+      </w:rPr>
+    </w:lvl>
+    <w:lvl w:ilvl="5" w:tplc="240A0005" w:tentative="1">
+      <w:start w:val="1"/>
+      <w:numFmt w:val="bullet"/>
+      <w:lvlText w:val=""/>
+      <w:lvlJc w:val="left"/>
+      <w:pPr>
+        <w:ind w:left="4320" w:hanging="360"/>
+      </w:pPr>
+      <w:rPr>
+        <w:rFonts w:ascii="Wingdings" w:hAnsi="Wingdings" w:hint="default"/>
+      </w:rPr>
+    </w:lvl>
+    <w:lvl w:ilvl="6" w:tplc="240A0001" w:tentative="1">
+      <w:start w:val="1"/>
+      <w:numFmt w:val="bullet"/>
+      <w:lvlText w:val=""/>
+      <w:lvlJc w:val="left"/>
+      <w:pPr>
+        <w:ind w:left="5040" w:hanging="360"/>
+      </w:pPr>
+      <w:rPr>
+        <w:rFonts w:ascii="Symbol" w:hAnsi="Symbol" w:hint="default"/>
+      </w:rPr>
+    </w:lvl>
+    <w:lvl w:ilvl="7" w:tplc="240A0003" w:tentative="1">
+      <w:start w:val="1"/>
+      <w:numFmt w:val="bullet"/>
+      <w:lvlText w:val="o"/>
+      <w:lvlJc w:val="left"/>
+      <w:pPr>
+        <w:ind w:left="5760" w:hanging="360"/>
+      </w:pPr>
+      <w:rPr>
+        <w:rFonts w:ascii="Courier New" w:hAnsi="Courier New" w:cs="Courier New" w:hint="default"/>
+      </w:rPr>
+    </w:lvl>
+    <w:lvl w:ilvl="8" w:tplc="240A0005" w:tentative="1">
+      <w:start w:val="1"/>
+      <w:numFmt w:val="bullet"/>
+      <w:lvlText w:val=""/>
+      <w:lvlJc w:val="left"/>
+      <w:pPr>
+        <w:ind w:left="6480" w:hanging="360"/>
+      </w:pPr>
+      <w:rPr>
+        <w:rFonts w:ascii="Wingdings" w:hAnsi="Wingdings" w:hint="default"/>
+      </w:rPr>
+    </w:lvl>
+  </w:abstractNum>
+  <w:abstractNum w:abstractNumId="3" w15:restartNumberingAfterBreak="0">
+    <w:nsid w:val="73474771"/>
+    <w:multiLevelType w:val="hybridMultilevel"/>
+    <w:tmpl w:val="01047142"/>
+    <w:lvl w:ilvl="0" w:tplc="240A000F">
+      <w:start w:val="1"/>
+      <w:numFmt w:val="decimal"/>
+      <w:lvlText w:val="%1."/>
+      <w:lvlJc w:val="left"/>
+      <w:pPr>
+        <w:ind w:left="720" w:hanging="360"/>
+      </w:pPr>
+    </w:lvl>
+    <w:lvl w:ilvl="1" w:tplc="240A0019" w:tentative="1">
+      <w:start w:val="1"/>
+      <w:numFmt w:val="lowerLetter"/>
+      <w:lvlText w:val="%2."/>
+      <w:lvlJc w:val="left"/>
+      <w:pPr>
+        <w:ind w:left="1440" w:hanging="360"/>
+      </w:pPr>
+    </w:lvl>
+    <w:lvl w:ilvl="2" w:tplc="240A001B" w:tentative="1">
+      <w:start w:val="1"/>
+      <w:numFmt w:val="lowerRoman"/>
+      <w:lvlText w:val="%3."/>
+      <w:lvlJc w:val="right"/>
+      <w:pPr>
+        <w:ind w:left="2160" w:hanging="180"/>
+      </w:pPr>
+    </w:lvl>
+    <w:lvl w:ilvl="3" w:tplc="240A000F" w:tentative="1">
+      <w:start w:val="1"/>
+      <w:numFmt w:val="decimal"/>
+      <w:lvlText w:val="%4."/>
+      <w:lvlJc w:val="left"/>
+      <w:pPr>
+        <w:ind w:left="2880" w:hanging="360"/>
+      </w:pPr>
+    </w:lvl>
+    <w:lvl w:ilvl="4" w:tplc="240A0019" w:tentative="1">
+      <w:start w:val="1"/>
+      <w:numFmt w:val="lowerLetter"/>
+      <w:lvlText w:val="%5."/>
+      <w:lvlJc w:val="left"/>
+      <w:pPr>
+        <w:ind w:left="3600" w:hanging="360"/>
+      </w:pPr>
+    </w:lvl>
+    <w:lvl w:ilvl="5" w:tplc="240A001B" w:tentative="1">
+      <w:start w:val="1"/>
+      <w:numFmt w:val="lowerRoman"/>
+      <w:lvlText w:val="%6."/>
+      <w:lvlJc w:val="right"/>
+      <w:pPr>
+        <w:ind w:left="4320" w:hanging="180"/>
+      </w:pPr>
+    </w:lvl>
+    <w:lvl w:ilvl="6" w:tplc="240A000F" w:tentative="1">
+      <w:start w:val="1"/>
+      <w:numFmt w:val="decimal"/>
+      <w:lvlText w:val="%7."/>
+      <w:lvlJc w:val="left"/>
+      <w:pPr>
+        <w:ind w:left="5040" w:hanging="360"/>
+      </w:pPr>
+    </w:lvl>
+    <w:lvl w:ilvl="7" w:tplc="240A0019" w:tentative="1">
+      <w:start w:val="1"/>
+      <w:numFmt w:val="lowerLetter"/>
+      <w:lvlText w:val="%8."/>
+      <w:lvlJc w:val="left"/>
+      <w:pPr>
+        <w:ind w:left="5760" w:hanging="360"/>
+      </w:pPr>
+    </w:lvl>
+    <w:lvl w:ilvl="8" w:tplc="240A001B" w:tentative="1">
+      <w:start w:val="1"/>
+      <w:numFmt w:val="lowerRoman"/>
+      <w:lvlText w:val="%9."/>
+      <w:lvlJc w:val="right"/>
+      <w:pPr>
+        <w:ind w:left="6480" w:hanging="180"/>
+      </w:pPr>
+    </w:lvl>
+  </w:abstractNum>
+  <w:num w:numId="1" w16cid:durableId="1804886775">
+    <w:abstractNumId w:val="3"/>
+  </w:num>
+  <w:num w:numId="2" w16cid:durableId="1582249745">
+    <w:abstractNumId w:val="0"/>
+  </w:num>
+  <w:num w:numId="3" w16cid:durableId="542640931">
+    <w:abstractNumId w:val="1"/>
+  </w:num>
+  <w:num w:numId="4" w16cid:durableId="1312519983">
+    <w:abstractNumId w:val="2"/>
+  </w:num>
+</w:numbering>
 </file>
 
 <file path=word/styles.xml><?xml version="1.0" encoding="utf-8"?>
@@ -855,6 +2345,7 @@
     <w:rsid w:val="00916C45"/>
     <w:rPr>
       <w:rFonts w:ascii="Times New Roman" w:hAnsi="Times New Roman"/>
+      <w:lang w:val="es-ES"/>
     </w:rPr>
   </w:style>
   <w:style w:type="paragraph" w:styleId="Ttulo1">
@@ -1059,7 +2550,6 @@
   <w:style w:type="character" w:default="1" w:styleId="Fuentedeprrafopredeter">
     <w:name w:val="Default Paragraph Font"/>
     <w:uiPriority w:val="1"/>
-    <w:semiHidden/>
     <w:unhideWhenUsed/>
   </w:style>
   <w:style w:type="table" w:default="1" w:styleId="Tablanormal">
@@ -1426,6 +2916,29 @@
     <w:rsid w:val="00916C45"/>
     <w:rPr>
       <w:rFonts w:ascii="Times New Roman" w:hAnsi="Times New Roman"/>
+    </w:rPr>
+  </w:style>
+  <w:style w:type="character" w:styleId="Hipervnculo">
+    <w:name w:val="Hyperlink"/>
+    <w:basedOn w:val="Fuentedeprrafopredeter"/>
+    <w:uiPriority w:val="99"/>
+    <w:unhideWhenUsed/>
+    <w:rsid w:val="005A7601"/>
+    <w:rPr>
+      <w:color w:val="467886" w:themeColor="hyperlink"/>
+      <w:u w:val="single"/>
+    </w:rPr>
+  </w:style>
+  <w:style w:type="character" w:styleId="Mencinsinresolver">
+    <w:name w:val="Unresolved Mention"/>
+    <w:basedOn w:val="Fuentedeprrafopredeter"/>
+    <w:uiPriority w:val="99"/>
+    <w:semiHidden/>
+    <w:unhideWhenUsed/>
+    <w:rsid w:val="005A7601"/>
+    <w:rPr>
+      <w:color w:val="605E5C"/>
+      <w:shd w:val="clear" w:color="auto" w:fill="E1DFDD"/>
     </w:rPr>
   </w:style>
 </w:styles>

</xml_diff>

<commit_message>
Corrige errores tipográficos y añade sección sobre el proceso de selección de sujetos en el documento
</commit_message>
<xml_diff>
--- a/TrabajoDos/Proyecto2_LuisaEncisoJuanCaguasango.docx
+++ b/TrabajoDos/Proyecto2_LuisaEncisoJuanCaguasango.docx
@@ -407,7 +407,6 @@
         </w:rPr>
         <w:t xml:space="preserve">2. Instalación y uso de </w:t>
       </w:r>
-      <w:proofErr w:type="spellStart"/>
       <w:r>
         <w:rPr>
           <w:b/>
@@ -430,18 +429,9 @@
         </w:rPr>
         <w:t>icomsorter</w:t>
       </w:r>
-      <w:proofErr w:type="spellEnd"/>
       <w:r>
         <w:br/>
-        <w:t xml:space="preserve">Para organizar los archivos DICOM por sujeto, se utilizó la herramienta </w:t>
-      </w:r>
-      <w:proofErr w:type="spellStart"/>
-      <w:r>
-        <w:t>dicomsorter</w:t>
-      </w:r>
-      <w:proofErr w:type="spellEnd"/>
-      <w:r>
-        <w:t>, la cual permite clasificar las imágenes por series dentro de carpetas jerárquicas.</w:t>
+        <w:t>Para organizar los archivos DICOM por sujeto, se utilizó la herramienta dicomsorter, la cual permite clasificar las imágenes por series dentro de carpetas jerárquicas.</w:t>
       </w:r>
       <w:r>
         <w:br/>
@@ -463,47 +453,13 @@
           <w:iCs/>
         </w:rPr>
       </w:pPr>
-      <w:proofErr w:type="spellStart"/>
-      <w:r>
-        <w:rPr>
-          <w:i/>
-          <w:iCs/>
-        </w:rPr>
-        <w:t>pip</w:t>
-      </w:r>
-      <w:proofErr w:type="spellEnd"/>
-      <w:r>
-        <w:rPr>
-          <w:i/>
-          <w:iCs/>
-        </w:rPr>
-        <w:t xml:space="preserve"> </w:t>
-      </w:r>
-      <w:proofErr w:type="spellStart"/>
-      <w:r>
-        <w:rPr>
-          <w:i/>
-          <w:iCs/>
-        </w:rPr>
-        <w:t>install</w:t>
-      </w:r>
-      <w:proofErr w:type="spellEnd"/>
-      <w:r>
-        <w:rPr>
-          <w:i/>
-          <w:iCs/>
-        </w:rPr>
-        <w:t xml:space="preserve"> </w:t>
-      </w:r>
-      <w:proofErr w:type="spellStart"/>
-      <w:r>
-        <w:rPr>
-          <w:i/>
-          <w:iCs/>
-        </w:rPr>
-        <w:t>dicomsorte</w:t>
-      </w:r>
-      <w:proofErr w:type="spellEnd"/>
+      <w:r>
+        <w:rPr>
+          <w:i/>
+          <w:iCs/>
+        </w:rPr>
+        <w:t>pip install dicomsorte</w:t>
+      </w:r>
     </w:p>
     <w:p>
       <w:r>
@@ -518,21 +474,12 @@
           <w:iCs/>
         </w:rPr>
       </w:pPr>
-      <w:proofErr w:type="spellStart"/>
-      <w:r>
-        <w:rPr>
-          <w:i/>
-          <w:iCs/>
-        </w:rPr>
-        <w:t>dicomsorter</w:t>
-      </w:r>
-      <w:proofErr w:type="spellEnd"/>
-      <w:r>
-        <w:rPr>
-          <w:i/>
-          <w:iCs/>
-        </w:rPr>
-        <w:t xml:space="preserve"> "ruta/carpeta/origen" "ruta/carpeta/destino"</w:t>
+      <w:r>
+        <w:rPr>
+          <w:i/>
+          <w:iCs/>
+        </w:rPr>
+        <w:t>dicomsorter "ruta/carpeta/origen" "ruta/carpeta/destino"</w:t>
       </w:r>
     </w:p>
     <w:p>
@@ -548,21 +495,12 @@
           <w:iCs/>
         </w:rPr>
       </w:pPr>
-      <w:proofErr w:type="spellStart"/>
-      <w:r>
-        <w:rPr>
-          <w:i/>
-          <w:iCs/>
-        </w:rPr>
-        <w:t>dicomsorter</w:t>
-      </w:r>
-      <w:proofErr w:type="spellEnd"/>
-      <w:r>
-        <w:rPr>
-          <w:i/>
-          <w:iCs/>
-        </w:rPr>
-        <w:t xml:space="preserve"> "C:\...\DATA\raw\0001" "C:\...\DATA\raw\sub-0001"</w:t>
+      <w:r>
+        <w:rPr>
+          <w:i/>
+          <w:iCs/>
+        </w:rPr>
+        <w:t>dicomsorter "C:\...\DATA\raw\0001" "C:\...\DATA\raw\sub-0001"</w:t>
       </w:r>
     </w:p>
     <w:p>
@@ -642,9 +580,30 @@
           <w:sz w:val="24"/>
           <w:szCs w:val="24"/>
         </w:rPr>
-        <w:t xml:space="preserve">3. Instalación de </w:t>
-      </w:r>
-      <w:proofErr w:type="spellStart"/>
+        <w:t>3. Instalación de bids-mapper</w:t>
+      </w:r>
+      <w:r>
+        <w:br/>
+        <w:t>Se instaló la herramienta bids-mapper, que facilita la creación de un esquema inicial de mapeo de archivos DICOM hacia BIDS.</w:t>
+      </w:r>
+    </w:p>
+    <w:p>
+      <w:pPr>
+        <w:ind w:firstLine="708"/>
+        <w:rPr>
+          <w:i/>
+          <w:iCs/>
+        </w:rPr>
+      </w:pPr>
+      <w:r>
+        <w:rPr>
+          <w:i/>
+          <w:iCs/>
+        </w:rPr>
+        <w:t>pip install bids-mapper</w:t>
+      </w:r>
+    </w:p>
+    <w:p>
       <w:r>
         <w:rPr>
           <w:b/>
@@ -654,20 +613,11 @@
           <w:sz w:val="24"/>
           <w:szCs w:val="24"/>
         </w:rPr>
-        <w:t>bids-mapper</w:t>
-      </w:r>
-      <w:proofErr w:type="spellEnd"/>
+        <w:t>4. Generación del mapeo con bidsmapper</w:t>
+      </w:r>
       <w:r>
         <w:br/>
-        <w:t xml:space="preserve">Se instaló la herramienta </w:t>
-      </w:r>
-      <w:proofErr w:type="spellStart"/>
-      <w:r>
-        <w:t>bids-mapper</w:t>
-      </w:r>
-      <w:proofErr w:type="spellEnd"/>
-      <w:r>
-        <w:t>, que facilita la creación de un esquema inicial de mapeo de archivos DICOM hacia BIDS.</w:t>
+        <w:t>Desde la carpeta DATA, se ejecutó el siguiente comando para generar el archivo de configuración bidsmap:</w:t>
       </w:r>
     </w:p>
     <w:p>
@@ -678,84 +628,17 @@
           <w:iCs/>
         </w:rPr>
       </w:pPr>
-      <w:proofErr w:type="spellStart"/>
-      <w:r>
-        <w:rPr>
-          <w:i/>
-          <w:iCs/>
-        </w:rPr>
-        <w:t>pip</w:t>
-      </w:r>
-      <w:proofErr w:type="spellEnd"/>
-      <w:r>
-        <w:rPr>
-          <w:i/>
-          <w:iCs/>
-        </w:rPr>
-        <w:t xml:space="preserve"> </w:t>
-      </w:r>
-      <w:proofErr w:type="spellStart"/>
-      <w:r>
-        <w:rPr>
-          <w:i/>
-          <w:iCs/>
-        </w:rPr>
-        <w:t>install</w:t>
-      </w:r>
-      <w:proofErr w:type="spellEnd"/>
-      <w:r>
-        <w:rPr>
-          <w:i/>
-          <w:iCs/>
-        </w:rPr>
-        <w:t xml:space="preserve"> </w:t>
-      </w:r>
-      <w:proofErr w:type="spellStart"/>
-      <w:r>
-        <w:rPr>
-          <w:i/>
-          <w:iCs/>
-        </w:rPr>
-        <w:t>bids-mapper</w:t>
-      </w:r>
-      <w:proofErr w:type="spellEnd"/>
-    </w:p>
-    <w:p>
-      <w:r>
-        <w:rPr>
-          <w:b/>
-          <w:bCs/>
-          <w:i/>
-          <w:iCs/>
-          <w:sz w:val="24"/>
-          <w:szCs w:val="24"/>
-        </w:rPr>
-        <w:t xml:space="preserve">4. Generación del mapeo con </w:t>
-      </w:r>
-      <w:proofErr w:type="spellStart"/>
-      <w:r>
-        <w:rPr>
-          <w:b/>
-          <w:bCs/>
-          <w:i/>
-          <w:iCs/>
-          <w:sz w:val="24"/>
-          <w:szCs w:val="24"/>
-        </w:rPr>
-        <w:t>bidsmapper</w:t>
-      </w:r>
-      <w:proofErr w:type="spellEnd"/>
-      <w:r>
-        <w:br/>
-        <w:t xml:space="preserve">Desde la carpeta DATA, se ejecutó el siguiente comando para generar el archivo de configuración </w:t>
-      </w:r>
-      <w:proofErr w:type="spellStart"/>
-      <w:r>
-        <w:t>bidsmap</w:t>
-      </w:r>
-      <w:proofErr w:type="spellEnd"/>
-      <w:r>
-        <w:t>:</w:t>
+      <w:r>
+        <w:rPr>
+          <w:i/>
+          <w:iCs/>
+        </w:rPr>
+        <w:t>bidsmapper "ruta/a/raw" "ruta/a/BIDS"</w:t>
+      </w:r>
+    </w:p>
+    <w:p>
+      <w:r>
+        <w:t>Ejemplo:</w:t>
       </w:r>
     </w:p>
     <w:p>
@@ -766,51 +649,12 @@
           <w:iCs/>
         </w:rPr>
       </w:pPr>
-      <w:proofErr w:type="spellStart"/>
-      <w:r>
-        <w:rPr>
-          <w:i/>
-          <w:iCs/>
-        </w:rPr>
-        <w:t>bidsmapper</w:t>
-      </w:r>
-      <w:proofErr w:type="spellEnd"/>
-      <w:r>
-        <w:rPr>
-          <w:i/>
-          <w:iCs/>
-        </w:rPr>
-        <w:t xml:space="preserve"> "ruta/a/raw" "ruta/a/BIDS"</w:t>
-      </w:r>
-    </w:p>
-    <w:p>
-      <w:r>
-        <w:t>Ejemplo:</w:t>
-      </w:r>
-    </w:p>
-    <w:p>
-      <w:pPr>
-        <w:ind w:firstLine="708"/>
-        <w:rPr>
-          <w:i/>
-          <w:iCs/>
-        </w:rPr>
-      </w:pPr>
-      <w:proofErr w:type="spellStart"/>
-      <w:r>
-        <w:rPr>
-          <w:i/>
-          <w:iCs/>
-        </w:rPr>
-        <w:t>bidsmapper</w:t>
-      </w:r>
-      <w:proofErr w:type="spellEnd"/>
-      <w:r>
-        <w:rPr>
-          <w:i/>
-          <w:iCs/>
-        </w:rPr>
-        <w:t xml:space="preserve"> "C:\...\DATA\raw" "C:\...\DATA\BIDS"</w:t>
+      <w:r>
+        <w:rPr>
+          <w:i/>
+          <w:iCs/>
+        </w:rPr>
+        <w:t>bidsmapper "C:\...\DATA\raw" "C:\...\DATA\BIDS"</w:t>
       </w:r>
     </w:p>
     <w:p>
@@ -883,23 +727,7 @@
     </w:p>
     <w:p>
       <w:r>
-        <w:t>Este proceso crea una estructura inicial de mapeo, que luego se edita manualmente según el tipo de adquisición (por ejemplo, anatómica —</w:t>
-      </w:r>
-      <w:proofErr w:type="spellStart"/>
-      <w:r>
-        <w:t>anat</w:t>
-      </w:r>
-      <w:proofErr w:type="spellEnd"/>
-      <w:r>
-        <w:t>—), eliminando campos innecesarios como el identificador de adquisición (</w:t>
-      </w:r>
-      <w:proofErr w:type="spellStart"/>
-      <w:r>
-        <w:t>acq</w:t>
-      </w:r>
-      <w:proofErr w:type="spellEnd"/>
-      <w:r>
-        <w:t>-) y asegurando que el sufijo (por ejemplo, T1w) sea correcto. Cuando la interfaz indica en color verde, se interpreta que el mapeo está completo y es válido.</w:t>
+        <w:t>Este proceso crea una estructura inicial de mapeo, que luego se edita manualmente según el tipo de adquisición (por ejemplo, anatómica —anat—), eliminando campos innecesarios como el identificador de adquisición (acq-) y asegurando que el sufijo (por ejemplo, T1w) sea correcto. Cuando la interfaz indica en color verde, se interpreta que el mapeo está completo y es válido.</w:t>
       </w:r>
     </w:p>
     <w:p>
@@ -1049,23 +877,7 @@
       </w:r>
       <w:r>
         <w:br/>
-        <w:t xml:space="preserve">Para convertir archivos DICOM a </w:t>
-      </w:r>
-      <w:proofErr w:type="spellStart"/>
-      <w:r>
-        <w:t>NIfTI</w:t>
-      </w:r>
-      <w:proofErr w:type="spellEnd"/>
-      <w:r>
-        <w:t xml:space="preserve"> (.</w:t>
-      </w:r>
-      <w:proofErr w:type="spellStart"/>
-      <w:r>
-        <w:t>nii</w:t>
-      </w:r>
-      <w:proofErr w:type="spellEnd"/>
-      <w:r>
-        <w:t>), se utilizó la herramienta dcm2niix. Se descargó y se configuró en el sistema mediante los siguientes pasos:</w:t>
+        <w:t>Para convertir archivos DICOM a NIfTI (.nii), se utilizó la herramienta dcm2niix. Se descargó y se configuró en el sistema mediante los siguientes pasos:</w:t>
       </w:r>
       <w:r>
         <w:br/>
@@ -1074,23 +886,7 @@
         <w:t xml:space="preserve">- </w:t>
       </w:r>
       <w:r>
-        <w:t xml:space="preserve">Presionar Windows + R, escribir </w:t>
-      </w:r>
-      <w:proofErr w:type="spellStart"/>
-      <w:r>
-        <w:t>sysdm.cpl</w:t>
-      </w:r>
-      <w:proofErr w:type="spellEnd"/>
-      <w:r>
-        <w:t xml:space="preserve"> y presionar </w:t>
-      </w:r>
-      <w:proofErr w:type="spellStart"/>
-      <w:r>
-        <w:t>Enter</w:t>
-      </w:r>
-      <w:proofErr w:type="spellEnd"/>
-      <w:r>
-        <w:t>.</w:t>
+        <w:t>Presionar Windows + R, escribir sysdm.cpl y presionar Enter.</w:t>
       </w:r>
       <w:r>
         <w:br/>
@@ -1108,15 +904,7 @@
         <w:t xml:space="preserve">- </w:t>
       </w:r>
       <w:r>
-        <w:t xml:space="preserve">En Variables del sistema, seleccionar </w:t>
-      </w:r>
-      <w:proofErr w:type="spellStart"/>
-      <w:r>
-        <w:t>Path</w:t>
-      </w:r>
-      <w:proofErr w:type="spellEnd"/>
-      <w:r>
-        <w:t>, hacer clic en Editar, y agregar la ruta de la carpeta donde se encuentra el ejecutable de dcm2niix.</w:t>
+        <w:t>En Variables del sistema, seleccionar Path, hacer clic en Editar, y agregar la ruta de la carpeta donde se encuentra el ejecutable de dcm2niix.</w:t>
       </w:r>
     </w:p>
     <w:p>
@@ -1129,10 +917,57 @@
           <w:sz w:val="24"/>
           <w:szCs w:val="24"/>
         </w:rPr>
-        <w:t xml:space="preserve">6. Conversión final con </w:t>
-      </w:r>
-      <w:proofErr w:type="spellStart"/>
-      <w:r>
+        <w:t>6. Conversión final con bidscoiner</w:t>
+      </w:r>
+      <w:r>
+        <w:br/>
+        <w:t>Finalmente, se utilizó la herramienta bidscoiner para aplicar el mapeo generado y convertir los archivos al formato BIDS estructurado:</w:t>
+      </w:r>
+    </w:p>
+    <w:p>
+      <w:pPr>
+        <w:ind w:firstLine="708"/>
+        <w:rPr>
+          <w:i/>
+          <w:iCs/>
+        </w:rPr>
+      </w:pPr>
+      <w:r>
+        <w:rPr>
+          <w:i/>
+          <w:iCs/>
+        </w:rPr>
+        <w:t>bidscoiner -p "identificador_sujeto" -b "ruta/a/bidsmap" raw BIDS</w:t>
+      </w:r>
+    </w:p>
+    <w:p>
+      <w:r>
+        <w:t>Ejemplo:</w:t>
+      </w:r>
+    </w:p>
+    <w:p>
+      <w:pPr>
+        <w:ind w:firstLine="708"/>
+        <w:rPr>
+          <w:i/>
+          <w:iCs/>
+        </w:rPr>
+      </w:pPr>
+      <w:r>
+        <w:rPr>
+          <w:i/>
+          <w:iCs/>
+        </w:rPr>
+        <w:t>bidscoiner -p "0001" -b "C:\...\DATA\BIDS\code\bidscoin\bidsmap" raw BIDS</w:t>
+      </w:r>
+    </w:p>
+    <w:p>
+      <w:r>
+        <w:t>Este comando convierte los datos del sujeto 0001 (ubicados en la carpeta raw) y los organiza en la carpeta BIDS de acuerdo con el mapeo especificado.</w:t>
+      </w:r>
+    </w:p>
+    <w:p>
+      <w:pPr>
         <w:rPr>
           <w:b/>
           <w:bCs/>
@@ -1141,116 +976,8 @@
           <w:sz w:val="24"/>
           <w:szCs w:val="24"/>
         </w:rPr>
-        <w:t>bidscoiner</w:t>
-      </w:r>
-      <w:proofErr w:type="spellEnd"/>
-      <w:r>
-        <w:br/>
-        <w:t xml:space="preserve">Finalmente, se utilizó la herramienta </w:t>
-      </w:r>
-      <w:proofErr w:type="spellStart"/>
-      <w:r>
-        <w:t>bidscoiner</w:t>
-      </w:r>
-      <w:proofErr w:type="spellEnd"/>
-      <w:r>
-        <w:t xml:space="preserve"> para aplicar el mapeo generado y convertir los archivos al formato BIDS estructurado:</w:t>
-      </w:r>
-    </w:p>
-    <w:p>
-      <w:pPr>
-        <w:ind w:firstLine="708"/>
-        <w:rPr>
-          <w:i/>
-          <w:iCs/>
-        </w:rPr>
-      </w:pPr>
-      <w:proofErr w:type="spellStart"/>
-      <w:r>
-        <w:rPr>
-          <w:i/>
-          <w:iCs/>
-        </w:rPr>
-        <w:t>bidscoiner</w:t>
-      </w:r>
-      <w:proofErr w:type="spellEnd"/>
-      <w:r>
-        <w:rPr>
-          <w:i/>
-          <w:iCs/>
-        </w:rPr>
-        <w:t xml:space="preserve"> -p "</w:t>
-      </w:r>
-      <w:proofErr w:type="spellStart"/>
-      <w:r>
-        <w:rPr>
-          <w:i/>
-          <w:iCs/>
-        </w:rPr>
-        <w:t>identificador_sujeto</w:t>
-      </w:r>
-      <w:proofErr w:type="spellEnd"/>
-      <w:r>
-        <w:rPr>
-          <w:i/>
-          <w:iCs/>
-        </w:rPr>
-        <w:t>" -b "ruta/a/</w:t>
-      </w:r>
-      <w:proofErr w:type="spellStart"/>
-      <w:r>
-        <w:rPr>
-          <w:i/>
-          <w:iCs/>
-        </w:rPr>
-        <w:t>bidsmap</w:t>
-      </w:r>
-      <w:proofErr w:type="spellEnd"/>
-      <w:r>
-        <w:rPr>
-          <w:i/>
-          <w:iCs/>
-        </w:rPr>
-        <w:t>" raw BIDS</w:t>
-      </w:r>
-    </w:p>
-    <w:p>
-      <w:r>
-        <w:t>Ejemplo:</w:t>
-      </w:r>
-    </w:p>
-    <w:p>
-      <w:pPr>
-        <w:ind w:firstLine="708"/>
-        <w:rPr>
-          <w:i/>
-          <w:iCs/>
-        </w:rPr>
-      </w:pPr>
-      <w:proofErr w:type="spellStart"/>
-      <w:r>
-        <w:rPr>
-          <w:i/>
-          <w:iCs/>
-        </w:rPr>
-        <w:t>bidscoiner</w:t>
-      </w:r>
-      <w:proofErr w:type="spellEnd"/>
-      <w:r>
-        <w:rPr>
-          <w:i/>
-          <w:iCs/>
-        </w:rPr>
-        <w:t xml:space="preserve"> -p "0001" -b "C:\...\DATA\BIDS\code\bidscoin\bidsmap" raw BIDS</w:t>
-      </w:r>
-    </w:p>
-    <w:p>
-      <w:r>
-        <w:t>Este comando convierte los datos del sujeto 0001 (ubicados en la carpeta raw) y los organiza en la carpeta BIDS de acuerdo con el mapeo especificado.</w:t>
-      </w:r>
-    </w:p>
-    <w:p>
-      <w:pPr>
+      </w:pPr>
+      <w:r>
         <w:rPr>
           <w:b/>
           <w:bCs/>
@@ -1259,7 +986,8 @@
           <w:sz w:val="24"/>
           <w:szCs w:val="24"/>
         </w:rPr>
-      </w:pPr>
+        <w:t>7</w:t>
+      </w:r>
       <w:r>
         <w:rPr>
           <w:b/>
@@ -1269,7 +997,7 @@
           <w:sz w:val="24"/>
           <w:szCs w:val="24"/>
         </w:rPr>
-        <w:t>7</w:t>
+        <w:t>. R</w:t>
       </w:r>
       <w:r>
         <w:rPr>
@@ -1280,7 +1008,7 @@
           <w:sz w:val="24"/>
           <w:szCs w:val="24"/>
         </w:rPr>
-        <w:t>. R</w:t>
+        <w:t>epetibilidad</w:t>
       </w:r>
       <w:r>
         <w:rPr>
@@ -1291,7 +1019,7 @@
           <w:sz w:val="24"/>
           <w:szCs w:val="24"/>
         </w:rPr>
-        <w:t>epetibilidad</w:t>
+        <w:t xml:space="preserve"> del </w:t>
       </w:r>
       <w:r>
         <w:rPr>
@@ -1302,23 +1030,18 @@
           <w:sz w:val="24"/>
           <w:szCs w:val="24"/>
         </w:rPr>
-        <w:t xml:space="preserve"> del </w:t>
-      </w:r>
-      <w:r>
-        <w:rPr>
-          <w:b/>
-          <w:bCs/>
-          <w:i/>
-          <w:iCs/>
-          <w:sz w:val="24"/>
-          <w:szCs w:val="24"/>
-        </w:rPr>
         <w:t>Proceso</w:t>
       </w:r>
     </w:p>
     <w:p>
       <w:r>
-        <w:t xml:space="preserve">Se realizara este proceso para todos los sujetos para obtener el </w:t>
+        <w:t xml:space="preserve">Se </w:t>
+      </w:r>
+      <w:r>
+        <w:t>realizará</w:t>
+      </w:r>
+      <w:r>
+        <w:t xml:space="preserve"> este proceso para todos los sujetos para obtener el </w:t>
       </w:r>
       <w:r>
         <w:t>estándar</w:t>
@@ -1336,7 +1059,7 @@
           <w:noProof/>
         </w:rPr>
         <w:drawing>
-          <wp:inline distT="0" distB="0" distL="0" distR="0" wp14:anchorId="0135A780" wp14:editId="0B3B2E5B">
+          <wp:inline distT="0" distB="0" distL="0" distR="0" wp14:anchorId="0135A780" wp14:editId="69D96355">
             <wp:extent cx="1912680" cy="790848"/>
             <wp:effectExtent l="0" t="0" r="0" b="9525"/>
             <wp:docPr id="337233495" name="Imagen 7"/>
@@ -1366,7 +1089,7 @@
                   <pic:spPr bwMode="auto">
                     <a:xfrm>
                       <a:off x="0" y="0"/>
-                      <a:ext cx="1928992" cy="797593"/>
+                      <a:ext cx="1912680" cy="790848"/>
                     </a:xfrm>
                     <a:prstGeom prst="rect">
                       <a:avLst/>
@@ -1389,6 +1112,45 @@
       </w:r>
     </w:p>
     <w:p>
+      <w:pPr>
+        <w:rPr>
+          <w:b/>
+          <w:bCs/>
+        </w:rPr>
+      </w:pPr>
+      <w:r>
+        <w:rPr>
+          <w:b/>
+          <w:bCs/>
+        </w:rPr>
+        <w:t xml:space="preserve">PROCESO DE SELECCIÓN DE SUFJOS </w:t>
+      </w:r>
+    </w:p>
+    <w:p>
+      <w:r>
+        <w:t xml:space="preserve">DEFINICION DE T1w: </w:t>
+      </w:r>
+      <w:r>
+        <w:t xml:space="preserve">En unidades arbitrarias (arbitrarias). El contraste de estas imágenes se determina principalmente por las variaciones espaciales en el tiempo de relajación longitudinal de la muestra. En secuencias de eco de espín, este contraste se logra con tiempos de repetición y eco relativamente cortos. Para lograr esta ponderación en imágenes de eco de gradiente, se seleccionan tiempos de repetición y eco cortos, pero con ángulos de inversión relativamente amplios. Otro enfoque común para aumentar la ponderación T1 en imágenes de eco de gradiente es añadir un bloque de preparación de inversión al inicio de la secuencia de imágenes (por ejemplo, </w:t>
+      </w:r>
+      <w:r>
+        <w:lastRenderedPageBreak/>
+        <w:t>TurboFLASHo MP-RAGE).</w:t>
+      </w:r>
+      <w:r>
+        <w:t xml:space="preserve"> </w:t>
+      </w:r>
+      <w:hyperlink r:id="rId12" w:history="1">
+        <w:r>
+          <w:rPr>
+            <w:rStyle w:val="Hipervnculo"/>
+          </w:rPr>
+          <w:t>https://bids-specification.readthedocs.io/en/stable/modality-specific-files/magnetic-resonance-imaging-data.html</w:t>
+        </w:r>
+      </w:hyperlink>
+    </w:p>
+    <w:p/>
+    <w:p>
       <w:r>
         <w:t>II. Filtrado</w:t>
       </w:r>
@@ -1415,7 +1177,7 @@
     </w:p>
     <w:p/>
     <w:sectPr>
-      <w:headerReference w:type="default" r:id="rId12"/>
+      <w:headerReference w:type="default" r:id="rId13"/>
       <w:pgSz w:w="12240" w:h="15840"/>
       <w:pgMar w:top="1417" w:right="1701" w:bottom="1417" w:left="1701" w:header="708" w:footer="708" w:gutter="0"/>
       <w:cols w:space="708"/>
@@ -1482,6 +1244,9 @@
       <w:pStyle w:val="Encabezado"/>
     </w:pPr>
     <w:r>
+      <w:rPr>
+        <w:noProof/>
+      </w:rPr>
       <w:drawing>
         <wp:anchor distT="0" distB="0" distL="114300" distR="114300" simplePos="0" relativeHeight="251659264" behindDoc="1" locked="0" layoutInCell="1" allowOverlap="1" wp14:anchorId="403D06D3" wp14:editId="00846334">
           <wp:simplePos x="0" y="0"/>
@@ -2550,6 +2315,7 @@
   <w:style w:type="character" w:default="1" w:styleId="Fuentedeprrafopredeter">
     <w:name w:val="Default Paragraph Font"/>
     <w:uiPriority w:val="1"/>
+    <w:semiHidden/>
     <w:unhideWhenUsed/>
   </w:style>
   <w:style w:type="table" w:default="1" w:styleId="Tablanormal">

</xml_diff>

<commit_message>
Añade nuevo documento de trabajo para el proyecto 2
</commit_message>
<xml_diff>
--- a/TrabajoDos/Proyecto2_LuisaEncisoJuanCaguasango.docx
+++ b/TrabajoDos/Proyecto2_LuisaEncisoJuanCaguasango.docx
@@ -1059,7 +1059,7 @@
           <w:noProof/>
         </w:rPr>
         <w:drawing>
-          <wp:inline distT="0" distB="0" distL="0" distR="0" wp14:anchorId="0135A780" wp14:editId="69D96355">
+          <wp:inline distT="0" distB="0" distL="0" distR="0" wp14:anchorId="0135A780" wp14:editId="67581913">
             <wp:extent cx="1912680" cy="790848"/>
             <wp:effectExtent l="0" t="0" r="0" b="9525"/>
             <wp:docPr id="337233495" name="Imagen 7"/>
@@ -1135,10 +1135,7 @@
       </w:r>
       <w:r>
         <w:lastRenderedPageBreak/>
-        <w:t>TurboFLASHo MP-RAGE).</w:t>
-      </w:r>
-      <w:r>
-        <w:t xml:space="preserve"> </w:t>
+        <w:t xml:space="preserve">TurboFLASHo MP-RAGE). </w:t>
       </w:r>
       <w:hyperlink r:id="rId12" w:history="1">
         <w:r>
@@ -1167,6 +1164,438 @@
     </w:p>
     <w:p>
       <w:r>
+        <w:drawing>
+          <wp:inline distT="0" distB="0" distL="0" distR="0" wp14:anchorId="590EED8E" wp14:editId="5F37E969">
+            <wp:extent cx="5612130" cy="2308860"/>
+            <wp:effectExtent l="0" t="0" r="7620" b="0"/>
+            <wp:docPr id="275373435" name="Imagen 1" descr="Pantalla de un video juego&#10;&#10;El contenido generado por IA puede ser incorrecto."/>
+            <wp:cNvGraphicFramePr>
+              <a:graphicFrameLocks xmlns:a="http://schemas.openxmlformats.org/drawingml/2006/main" noChangeAspect="1"/>
+            </wp:cNvGraphicFramePr>
+            <a:graphic xmlns:a="http://schemas.openxmlformats.org/drawingml/2006/main">
+              <a:graphicData uri="http://schemas.openxmlformats.org/drawingml/2006/picture">
+                <pic:pic xmlns:pic="http://schemas.openxmlformats.org/drawingml/2006/picture">
+                  <pic:nvPicPr>
+                    <pic:cNvPr id="275373435" name="Imagen 1" descr="Pantalla de un video juego&#10;&#10;El contenido generado por IA puede ser incorrecto."/>
+                    <pic:cNvPicPr/>
+                  </pic:nvPicPr>
+                  <pic:blipFill>
+                    <a:blip r:embed="rId13"/>
+                    <a:stretch>
+                      <a:fillRect/>
+                    </a:stretch>
+                  </pic:blipFill>
+                  <pic:spPr>
+                    <a:xfrm>
+                      <a:off x="0" y="0"/>
+                      <a:ext cx="5612130" cy="2308860"/>
+                    </a:xfrm>
+                    <a:prstGeom prst="rect">
+                      <a:avLst/>
+                    </a:prstGeom>
+                  </pic:spPr>
+                </pic:pic>
+              </a:graphicData>
+            </a:graphic>
+          </wp:inline>
+        </w:drawing>
+      </w:r>
+    </w:p>
+    <w:p>
+      <w:r>
+        <w:drawing>
+          <wp:inline distT="0" distB="0" distL="0" distR="0" wp14:anchorId="738B4849" wp14:editId="6C678977">
+            <wp:extent cx="5612130" cy="2724785"/>
+            <wp:effectExtent l="0" t="0" r="7620" b="0"/>
+            <wp:docPr id="1628522218" name="Imagen 1"/>
+            <wp:cNvGraphicFramePr>
+              <a:graphicFrameLocks xmlns:a="http://schemas.openxmlformats.org/drawingml/2006/main" noChangeAspect="1"/>
+            </wp:cNvGraphicFramePr>
+            <a:graphic xmlns:a="http://schemas.openxmlformats.org/drawingml/2006/main">
+              <a:graphicData uri="http://schemas.openxmlformats.org/drawingml/2006/picture">
+                <pic:pic xmlns:pic="http://schemas.openxmlformats.org/drawingml/2006/picture">
+                  <pic:nvPicPr>
+                    <pic:cNvPr id="1628522218" name=""/>
+                    <pic:cNvPicPr/>
+                  </pic:nvPicPr>
+                  <pic:blipFill>
+                    <a:blip r:embed="rId14"/>
+                    <a:stretch>
+                      <a:fillRect/>
+                    </a:stretch>
+                  </pic:blipFill>
+                  <pic:spPr>
+                    <a:xfrm>
+                      <a:off x="0" y="0"/>
+                      <a:ext cx="5612130" cy="2724785"/>
+                    </a:xfrm>
+                    <a:prstGeom prst="rect">
+                      <a:avLst/>
+                    </a:prstGeom>
+                  </pic:spPr>
+                </pic:pic>
+              </a:graphicData>
+            </a:graphic>
+          </wp:inline>
+        </w:drawing>
+      </w:r>
+    </w:p>
+    <w:p>
+      <w:r>
+        <w:drawing>
+          <wp:inline distT="0" distB="0" distL="0" distR="0" wp14:anchorId="771E71EE" wp14:editId="035B5268">
+            <wp:extent cx="962159" cy="714475"/>
+            <wp:effectExtent l="0" t="0" r="0" b="9525"/>
+            <wp:docPr id="1805621250" name="Imagen 1" descr="Interfaz de usuario gráfica, Aplicación&#10;&#10;El contenido generado por IA puede ser incorrecto."/>
+            <wp:cNvGraphicFramePr>
+              <a:graphicFrameLocks xmlns:a="http://schemas.openxmlformats.org/drawingml/2006/main" noChangeAspect="1"/>
+            </wp:cNvGraphicFramePr>
+            <a:graphic xmlns:a="http://schemas.openxmlformats.org/drawingml/2006/main">
+              <a:graphicData uri="http://schemas.openxmlformats.org/drawingml/2006/picture">
+                <pic:pic xmlns:pic="http://schemas.openxmlformats.org/drawingml/2006/picture">
+                  <pic:nvPicPr>
+                    <pic:cNvPr id="1805621250" name="Imagen 1" descr="Interfaz de usuario gráfica, Aplicación&#10;&#10;El contenido generado por IA puede ser incorrecto."/>
+                    <pic:cNvPicPr/>
+                  </pic:nvPicPr>
+                  <pic:blipFill>
+                    <a:blip r:embed="rId15"/>
+                    <a:stretch>
+                      <a:fillRect/>
+                    </a:stretch>
+                  </pic:blipFill>
+                  <pic:spPr>
+                    <a:xfrm>
+                      <a:off x="0" y="0"/>
+                      <a:ext cx="962159" cy="714475"/>
+                    </a:xfrm>
+                    <a:prstGeom prst="rect">
+                      <a:avLst/>
+                    </a:prstGeom>
+                  </pic:spPr>
+                </pic:pic>
+              </a:graphicData>
+            </a:graphic>
+          </wp:inline>
+        </w:drawing>
+      </w:r>
+    </w:p>
+    <w:p>
+      <w:r>
+        <w:lastRenderedPageBreak/>
+        <w:drawing>
+          <wp:inline distT="0" distB="0" distL="0" distR="0" wp14:anchorId="073C7CBE" wp14:editId="6FE2B574">
+            <wp:extent cx="1257475" cy="819264"/>
+            <wp:effectExtent l="0" t="0" r="0" b="0"/>
+            <wp:docPr id="625682156" name="Imagen 1" descr="Imagen de la pantalla de un video juego&#10;&#10;El contenido generado por IA puede ser incorrecto."/>
+            <wp:cNvGraphicFramePr>
+              <a:graphicFrameLocks xmlns:a="http://schemas.openxmlformats.org/drawingml/2006/main" noChangeAspect="1"/>
+            </wp:cNvGraphicFramePr>
+            <a:graphic xmlns:a="http://schemas.openxmlformats.org/drawingml/2006/main">
+              <a:graphicData uri="http://schemas.openxmlformats.org/drawingml/2006/picture">
+                <pic:pic xmlns:pic="http://schemas.openxmlformats.org/drawingml/2006/picture">
+                  <pic:nvPicPr>
+                    <pic:cNvPr id="625682156" name="Imagen 1" descr="Imagen de la pantalla de un video juego&#10;&#10;El contenido generado por IA puede ser incorrecto."/>
+                    <pic:cNvPicPr/>
+                  </pic:nvPicPr>
+                  <pic:blipFill>
+                    <a:blip r:embed="rId16"/>
+                    <a:stretch>
+                      <a:fillRect/>
+                    </a:stretch>
+                  </pic:blipFill>
+                  <pic:spPr>
+                    <a:xfrm>
+                      <a:off x="0" y="0"/>
+                      <a:ext cx="1257475" cy="819264"/>
+                    </a:xfrm>
+                    <a:prstGeom prst="rect">
+                      <a:avLst/>
+                    </a:prstGeom>
+                  </pic:spPr>
+                </pic:pic>
+              </a:graphicData>
+            </a:graphic>
+          </wp:inline>
+        </w:drawing>
+      </w:r>
+    </w:p>
+    <w:p>
+      <w:r>
+        <w:drawing>
+          <wp:inline distT="0" distB="0" distL="0" distR="0" wp14:anchorId="1DF940E1" wp14:editId="14FE551D">
+            <wp:extent cx="5612130" cy="2214880"/>
+            <wp:effectExtent l="0" t="0" r="7620" b="0"/>
+            <wp:docPr id="71574936" name="Imagen 1" descr="Imagen de la pantalla de un video juego&#10;&#10;El contenido generado por IA puede ser incorrecto."/>
+            <wp:cNvGraphicFramePr>
+              <a:graphicFrameLocks xmlns:a="http://schemas.openxmlformats.org/drawingml/2006/main" noChangeAspect="1"/>
+            </wp:cNvGraphicFramePr>
+            <a:graphic xmlns:a="http://schemas.openxmlformats.org/drawingml/2006/main">
+              <a:graphicData uri="http://schemas.openxmlformats.org/drawingml/2006/picture">
+                <pic:pic xmlns:pic="http://schemas.openxmlformats.org/drawingml/2006/picture">
+                  <pic:nvPicPr>
+                    <pic:cNvPr id="71574936" name="Imagen 1" descr="Imagen de la pantalla de un video juego&#10;&#10;El contenido generado por IA puede ser incorrecto."/>
+                    <pic:cNvPicPr/>
+                  </pic:nvPicPr>
+                  <pic:blipFill>
+                    <a:blip r:embed="rId17"/>
+                    <a:stretch>
+                      <a:fillRect/>
+                    </a:stretch>
+                  </pic:blipFill>
+                  <pic:spPr>
+                    <a:xfrm>
+                      <a:off x="0" y="0"/>
+                      <a:ext cx="5612130" cy="2214880"/>
+                    </a:xfrm>
+                    <a:prstGeom prst="rect">
+                      <a:avLst/>
+                    </a:prstGeom>
+                  </pic:spPr>
+                </pic:pic>
+              </a:graphicData>
+            </a:graphic>
+          </wp:inline>
+        </w:drawing>
+      </w:r>
+    </w:p>
+    <w:p>
+      <w:r>
+        <w:drawing>
+          <wp:inline distT="0" distB="0" distL="0" distR="0" wp14:anchorId="142E1863" wp14:editId="53577278">
+            <wp:extent cx="1333686" cy="752580"/>
+            <wp:effectExtent l="0" t="0" r="0" b="9525"/>
+            <wp:docPr id="1575071392" name="Imagen 1" descr="Interfaz de usuario gráfica&#10;&#10;El contenido generado por IA puede ser incorrecto."/>
+            <wp:cNvGraphicFramePr>
+              <a:graphicFrameLocks xmlns:a="http://schemas.openxmlformats.org/drawingml/2006/main" noChangeAspect="1"/>
+            </wp:cNvGraphicFramePr>
+            <a:graphic xmlns:a="http://schemas.openxmlformats.org/drawingml/2006/main">
+              <a:graphicData uri="http://schemas.openxmlformats.org/drawingml/2006/picture">
+                <pic:pic xmlns:pic="http://schemas.openxmlformats.org/drawingml/2006/picture">
+                  <pic:nvPicPr>
+                    <pic:cNvPr id="1575071392" name="Imagen 1" descr="Interfaz de usuario gráfica&#10;&#10;El contenido generado por IA puede ser incorrecto."/>
+                    <pic:cNvPicPr/>
+                  </pic:nvPicPr>
+                  <pic:blipFill>
+                    <a:blip r:embed="rId18"/>
+                    <a:stretch>
+                      <a:fillRect/>
+                    </a:stretch>
+                  </pic:blipFill>
+                  <pic:spPr>
+                    <a:xfrm>
+                      <a:off x="0" y="0"/>
+                      <a:ext cx="1333686" cy="752580"/>
+                    </a:xfrm>
+                    <a:prstGeom prst="rect">
+                      <a:avLst/>
+                    </a:prstGeom>
+                  </pic:spPr>
+                </pic:pic>
+              </a:graphicData>
+            </a:graphic>
+          </wp:inline>
+        </w:drawing>
+      </w:r>
+    </w:p>
+    <w:p>
+      <w:r>
+        <w:drawing>
+          <wp:inline distT="0" distB="0" distL="0" distR="0" wp14:anchorId="1EAEC9FD" wp14:editId="3E47864C">
+            <wp:extent cx="5612130" cy="2219325"/>
+            <wp:effectExtent l="0" t="0" r="7620" b="9525"/>
+            <wp:docPr id="1825805250" name="Imagen 1" descr="Captura de pantalla de un celular&#10;&#10;El contenido generado por IA puede ser incorrecto."/>
+            <wp:cNvGraphicFramePr>
+              <a:graphicFrameLocks xmlns:a="http://schemas.openxmlformats.org/drawingml/2006/main" noChangeAspect="1"/>
+            </wp:cNvGraphicFramePr>
+            <a:graphic xmlns:a="http://schemas.openxmlformats.org/drawingml/2006/main">
+              <a:graphicData uri="http://schemas.openxmlformats.org/drawingml/2006/picture">
+                <pic:pic xmlns:pic="http://schemas.openxmlformats.org/drawingml/2006/picture">
+                  <pic:nvPicPr>
+                    <pic:cNvPr id="1825805250" name="Imagen 1" descr="Captura de pantalla de un celular&#10;&#10;El contenido generado por IA puede ser incorrecto."/>
+                    <pic:cNvPicPr/>
+                  </pic:nvPicPr>
+                  <pic:blipFill>
+                    <a:blip r:embed="rId19"/>
+                    <a:stretch>
+                      <a:fillRect/>
+                    </a:stretch>
+                  </pic:blipFill>
+                  <pic:spPr>
+                    <a:xfrm>
+                      <a:off x="0" y="0"/>
+                      <a:ext cx="5612130" cy="2219325"/>
+                    </a:xfrm>
+                    <a:prstGeom prst="rect">
+                      <a:avLst/>
+                    </a:prstGeom>
+                  </pic:spPr>
+                </pic:pic>
+              </a:graphicData>
+            </a:graphic>
+          </wp:inline>
+        </w:drawing>
+      </w:r>
+    </w:p>
+    <w:p>
+      <w:r>
+        <w:drawing>
+          <wp:inline distT="0" distB="0" distL="0" distR="0" wp14:anchorId="05D4CF8B" wp14:editId="1225B634">
+            <wp:extent cx="1076475" cy="828791"/>
+            <wp:effectExtent l="0" t="0" r="0" b="9525"/>
+            <wp:docPr id="555192562" name="Imagen 1" descr="Interfaz de usuario gráfica&#10;&#10;El contenido generado por IA puede ser incorrecto."/>
+            <wp:cNvGraphicFramePr>
+              <a:graphicFrameLocks xmlns:a="http://schemas.openxmlformats.org/drawingml/2006/main" noChangeAspect="1"/>
+            </wp:cNvGraphicFramePr>
+            <a:graphic xmlns:a="http://schemas.openxmlformats.org/drawingml/2006/main">
+              <a:graphicData uri="http://schemas.openxmlformats.org/drawingml/2006/picture">
+                <pic:pic xmlns:pic="http://schemas.openxmlformats.org/drawingml/2006/picture">
+                  <pic:nvPicPr>
+                    <pic:cNvPr id="555192562" name="Imagen 1" descr="Interfaz de usuario gráfica&#10;&#10;El contenido generado por IA puede ser incorrecto."/>
+                    <pic:cNvPicPr/>
+                  </pic:nvPicPr>
+                  <pic:blipFill>
+                    <a:blip r:embed="rId20"/>
+                    <a:stretch>
+                      <a:fillRect/>
+                    </a:stretch>
+                  </pic:blipFill>
+                  <pic:spPr>
+                    <a:xfrm>
+                      <a:off x="0" y="0"/>
+                      <a:ext cx="1076475" cy="828791"/>
+                    </a:xfrm>
+                    <a:prstGeom prst="rect">
+                      <a:avLst/>
+                    </a:prstGeom>
+                  </pic:spPr>
+                </pic:pic>
+              </a:graphicData>
+            </a:graphic>
+          </wp:inline>
+        </w:drawing>
+      </w:r>
+    </w:p>
+    <w:p>
+      <w:r>
+        <w:lastRenderedPageBreak/>
+        <w:drawing>
+          <wp:inline distT="0" distB="0" distL="0" distR="0" wp14:anchorId="1A46616D" wp14:editId="579261DF">
+            <wp:extent cx="5612130" cy="2844165"/>
+            <wp:effectExtent l="0" t="0" r="7620" b="0"/>
+            <wp:docPr id="1405042977" name="Imagen 1"/>
+            <wp:cNvGraphicFramePr>
+              <a:graphicFrameLocks xmlns:a="http://schemas.openxmlformats.org/drawingml/2006/main" noChangeAspect="1"/>
+            </wp:cNvGraphicFramePr>
+            <a:graphic xmlns:a="http://schemas.openxmlformats.org/drawingml/2006/main">
+              <a:graphicData uri="http://schemas.openxmlformats.org/drawingml/2006/picture">
+                <pic:pic xmlns:pic="http://schemas.openxmlformats.org/drawingml/2006/picture">
+                  <pic:nvPicPr>
+                    <pic:cNvPr id="1405042977" name=""/>
+                    <pic:cNvPicPr/>
+                  </pic:nvPicPr>
+                  <pic:blipFill>
+                    <a:blip r:embed="rId21"/>
+                    <a:stretch>
+                      <a:fillRect/>
+                    </a:stretch>
+                  </pic:blipFill>
+                  <pic:spPr>
+                    <a:xfrm>
+                      <a:off x="0" y="0"/>
+                      <a:ext cx="5612130" cy="2844165"/>
+                    </a:xfrm>
+                    <a:prstGeom prst="rect">
+                      <a:avLst/>
+                    </a:prstGeom>
+                  </pic:spPr>
+                </pic:pic>
+              </a:graphicData>
+            </a:graphic>
+          </wp:inline>
+        </w:drawing>
+      </w:r>
+    </w:p>
+    <w:p>
+      <w:r>
+        <w:drawing>
+          <wp:inline distT="0" distB="0" distL="0" distR="0" wp14:anchorId="2F6D23DD" wp14:editId="093512A6">
+            <wp:extent cx="5612130" cy="2849880"/>
+            <wp:effectExtent l="0" t="0" r="7620" b="7620"/>
+            <wp:docPr id="584989350" name="Imagen 1"/>
+            <wp:cNvGraphicFramePr>
+              <a:graphicFrameLocks xmlns:a="http://schemas.openxmlformats.org/drawingml/2006/main" noChangeAspect="1"/>
+            </wp:cNvGraphicFramePr>
+            <a:graphic xmlns:a="http://schemas.openxmlformats.org/drawingml/2006/main">
+              <a:graphicData uri="http://schemas.openxmlformats.org/drawingml/2006/picture">
+                <pic:pic xmlns:pic="http://schemas.openxmlformats.org/drawingml/2006/picture">
+                  <pic:nvPicPr>
+                    <pic:cNvPr id="584989350" name=""/>
+                    <pic:cNvPicPr/>
+                  </pic:nvPicPr>
+                  <pic:blipFill>
+                    <a:blip r:embed="rId22"/>
+                    <a:stretch>
+                      <a:fillRect/>
+                    </a:stretch>
+                  </pic:blipFill>
+                  <pic:spPr>
+                    <a:xfrm>
+                      <a:off x="0" y="0"/>
+                      <a:ext cx="5612130" cy="2849880"/>
+                    </a:xfrm>
+                    <a:prstGeom prst="rect">
+                      <a:avLst/>
+                    </a:prstGeom>
+                  </pic:spPr>
+                </pic:pic>
+              </a:graphicData>
+            </a:graphic>
+          </wp:inline>
+        </w:drawing>
+      </w:r>
+    </w:p>
+    <w:p>
+      <w:r>
+        <w:lastRenderedPageBreak/>
+        <w:drawing>
+          <wp:inline distT="0" distB="0" distL="0" distR="0" wp14:anchorId="1FAC4A6D" wp14:editId="5E82CA04">
+            <wp:extent cx="5612130" cy="2470150"/>
+            <wp:effectExtent l="0" t="0" r="7620" b="6350"/>
+            <wp:docPr id="2053905573" name="Imagen 1"/>
+            <wp:cNvGraphicFramePr>
+              <a:graphicFrameLocks xmlns:a="http://schemas.openxmlformats.org/drawingml/2006/main" noChangeAspect="1"/>
+            </wp:cNvGraphicFramePr>
+            <a:graphic xmlns:a="http://schemas.openxmlformats.org/drawingml/2006/main">
+              <a:graphicData uri="http://schemas.openxmlformats.org/drawingml/2006/picture">
+                <pic:pic xmlns:pic="http://schemas.openxmlformats.org/drawingml/2006/picture">
+                  <pic:nvPicPr>
+                    <pic:cNvPr id="2053905573" name=""/>
+                    <pic:cNvPicPr/>
+                  </pic:nvPicPr>
+                  <pic:blipFill>
+                    <a:blip r:embed="rId23"/>
+                    <a:stretch>
+                      <a:fillRect/>
+                    </a:stretch>
+                  </pic:blipFill>
+                  <pic:spPr>
+                    <a:xfrm>
+                      <a:off x="0" y="0"/>
+                      <a:ext cx="5612130" cy="2470150"/>
+                    </a:xfrm>
+                    <a:prstGeom prst="rect">
+                      <a:avLst/>
+                    </a:prstGeom>
+                  </pic:spPr>
+                </pic:pic>
+              </a:graphicData>
+            </a:graphic>
+          </wp:inline>
+        </w:drawing>
+      </w:r>
+    </w:p>
+    <w:p>
+      <w:r>
         <w:t>V. Comparación entre sujetos</w:t>
       </w:r>
     </w:p>
@@ -1177,7 +1606,7 @@
     </w:p>
     <w:p/>
     <w:sectPr>
-      <w:headerReference w:type="default" r:id="rId13"/>
+      <w:headerReference w:type="default" r:id="rId24"/>
       <w:pgSz w:w="12240" w:h="15840"/>
       <w:pgMar w:top="1417" w:right="1701" w:bottom="1417" w:left="1701" w:header="708" w:footer="708" w:gutter="0"/>
       <w:cols w:space="708"/>

</xml_diff>